<commit_message>
Update manuale utente cinemax.docx
</commit_message>
<xml_diff>
--- a/documentazione/manuale utente cinemax.docx
+++ b/documentazione/manuale utente cinemax.docx
@@ -1,7 +1,20 @@
 
 <file path=word/document.xml><?xml version="1.0" encoding="utf-8"?>
-<w:document xmlns:wpc="http://schemas.microsoft.com/office/word/2010/wordprocessingCanvas" xmlns:cx="http://schemas.microsoft.com/office/drawing/2014/chartex" xmlns:cx1="http://schemas.microsoft.com/office/drawing/2015/9/8/chartex" xmlns:cx2="http://schemas.microsoft.com/office/drawing/2015/10/21/chartex" xmlns:cx3="http://schemas.microsoft.com/office/drawing/2016/5/9/chartex" xmlns:cx4="http://schemas.microsoft.com/office/drawing/2016/5/10/chartex" xmlns:cx5="http://schemas.microsoft.com/office/drawing/2016/5/11/chartex" xmlns:cx6="http://schemas.microsoft.com/office/drawing/2016/5/12/chartex" xmlns:cx7="http://schemas.microsoft.com/office/drawing/2016/5/13/chartex" xmlns:cx8="http://schemas.microsoft.com/office/drawing/2016/5/14/chartex" xmlns:mc="http://schemas.openxmlformats.org/markup-compatibility/2006" xmlns:aink="http://schemas.microsoft.com/office/drawing/2016/ink" xmlns:am3d="http://schemas.microsoft.com/office/drawing/2017/model3d" xmlns:o="urn:schemas-microsoft-com:office:office" xmlns:oel="http://schemas.microsoft.com/office/2019/extlst" xmlns:r="http://schemas.openxmlformats.org/officeDocument/2006/relationships" xmlns:m="http://schemas.openxmlformats.org/officeDocument/2006/math" xmlns:v="urn:schemas-microsoft-com:vml" xmlns:wp14="http://schemas.microsoft.com/office/word/2010/wordprocessingDrawing" xmlns:wp="http://schemas.openxmlformats.org/drawingml/2006/wordprocessingDrawing" xmlns:w10="urn:schemas-microsoft-com:office:word" xmlns:w="http://schemas.openxmlformats.org/wordprocessingml/2006/main" xmlns:w14="http://schemas.microsoft.com/office/word/2010/wordml" xmlns:w15="http://schemas.microsoft.com/office/word/2012/wordml" xmlns:w16cei="http://schemas.microsoft.com/office/word/2026/wordml/cei" xmlns:w16cex="http://schemas.microsoft.com/office/word/2018/wordml/cex" xmlns:w16cid="http://schemas.microsoft.com/office/word/2016/wordml/cid" xmlns:w16="http://schemas.microsoft.com/office/word/2018/wordml" xmlns:w16du="http://schemas.microsoft.com/office/word/2023/wordml/word16du" xmlns:w16sdtdh="http://schemas.microsoft.com/office/word/2020/wordml/sdtdatahash" xmlns:w16sdtfl="http://schemas.microsoft.com/office/word/2024/wordml/sdtformatlock" xmlns:w16se="http://schemas.microsoft.com/office/word/2015/wordml/symex" xmlns:wpg="http://schemas.microsoft.com/office/word/2010/wordprocessingGroup" xmlns:wpi="http://schemas.microsoft.com/office/word/2010/wordprocessingInk" xmlns:wne="http://schemas.microsoft.com/office/word/2006/wordml" xmlns:wps="http://schemas.microsoft.com/office/word/2010/wordprocessingShape" mc:Ignorable="w14 w15 w16se w16cid w16 w16cex w16sdtdh w16sdtfl w16du wp14">
+<w:document xmlns:wpc="http://schemas.microsoft.com/office/word/2010/wordprocessingCanvas" xmlns:cx="http://schemas.microsoft.com/office/drawing/2014/chartex" xmlns:cx1="http://schemas.microsoft.com/office/drawing/2015/9/8/chartex" xmlns:cx2="http://schemas.microsoft.com/office/drawing/2015/10/21/chartex" xmlns:cx3="http://schemas.microsoft.com/office/drawing/2016/5/9/chartex" xmlns:cx4="http://schemas.microsoft.com/office/drawing/2016/5/10/chartex" xmlns:cx5="http://schemas.microsoft.com/office/drawing/2016/5/11/chartex" xmlns:cx6="http://schemas.microsoft.com/office/drawing/2016/5/12/chartex" xmlns:cx7="http://schemas.microsoft.com/office/drawing/2016/5/13/chartex" xmlns:cx8="http://schemas.microsoft.com/office/drawing/2016/5/14/chartex" xmlns:mc="http://schemas.openxmlformats.org/markup-compatibility/2006" xmlns:aink="http://schemas.microsoft.com/office/drawing/2016/ink" xmlns:am3d="http://schemas.microsoft.com/office/drawing/2017/model3d" xmlns:o="urn:schemas-microsoft-com:office:office" xmlns:oel="http://schemas.microsoft.com/office/2019/extlst" xmlns:r="http://schemas.openxmlformats.org/officeDocument/2006/relationships" xmlns:m="http://schemas.openxmlformats.org/officeDocument/2006/math" xmlns:v="urn:schemas-microsoft-com:vml" xmlns:wp14="http://schemas.microsoft.com/office/word/2010/wordprocessingDrawing" xmlns:wp="http://schemas.openxmlformats.org/drawingml/2006/wordprocessingDrawing" xmlns:w10="urn:schemas-microsoft-com:office:word" xmlns:w="http://schemas.openxmlformats.org/wordprocessingml/2006/main" xmlns:w14="http://schemas.microsoft.com/office/word/2010/wordml" xmlns:w15="http://schemas.microsoft.com/office/word/2012/wordml" xmlns:w16cex="http://schemas.microsoft.com/office/word/2018/wordml/cex" xmlns:w16cid="http://schemas.microsoft.com/office/word/2016/wordml/cid" xmlns:w16="http://schemas.microsoft.com/office/word/2018/wordml" xmlns:w16du="http://schemas.microsoft.com/office/word/2023/wordml/word16du" xmlns:w16sdtdh="http://schemas.microsoft.com/office/word/2020/wordml/sdtdatahash" xmlns:w16sdtfl="http://schemas.microsoft.com/office/word/2024/wordml/sdtformatlock" xmlns:w16se="http://schemas.microsoft.com/office/word/2015/wordml/symex" xmlns:wpg="http://schemas.microsoft.com/office/word/2010/wordprocessingGroup" xmlns:wpi="http://schemas.microsoft.com/office/word/2010/wordprocessingInk" xmlns:wne="http://schemas.microsoft.com/office/word/2006/wordml" xmlns:wps="http://schemas.microsoft.com/office/word/2010/wordprocessingShape" mc:Ignorable="w14 w15 w16se w16cid w16 w16cex w16sdtdh w16sdtfl w16du wp14">
   <w:body>
+    <w:p>
+      <w:pPr>
+        <w:pStyle w:val="Titolo1"/>
+      </w:pPr>
+      <w:r>
+        <w:t xml:space="preserve">Manuale Utente Applicativo </w:t>
+      </w:r>
+      <w:proofErr w:type="spellStart"/>
+      <w:r>
+        <w:t>CineMax</w:t>
+      </w:r>
+      <w:proofErr w:type="spellEnd"/>
+    </w:p>
     <w:p>
       <w:pPr>
         <w:rPr>
@@ -9,150 +22,176 @@
           <w:bCs/>
         </w:rPr>
       </w:pPr>
+    </w:p>
+    <w:p>
+      <w:r>
+        <w:t xml:space="preserve">Benvenuto nell'applicativo </w:t>
+      </w:r>
+      <w:proofErr w:type="spellStart"/>
       <w:r>
         <w:rPr>
           <w:b/>
           <w:bCs/>
         </w:rPr>
-        <w:t xml:space="preserve">Manuale Utente Applicativo </w:t>
+        <w:t>CineMax</w:t>
+      </w:r>
+      <w:proofErr w:type="spellEnd"/>
+      <w:r>
+        <w:t xml:space="preserve">, la soluzione software integrata per la gestione cinematografica sviluppata nell'ambito del </w:t>
+      </w:r>
+      <w:r>
+        <w:rPr>
+          <w:i/>
+          <w:iCs/>
+        </w:rPr>
+        <w:t>Laboratorio Interdisciplinare B</w:t>
+      </w:r>
+      <w:r>
+        <w:t xml:space="preserve"> presso l'Università degli Studi dell'Insubria. Il sistema è stato concepito come un'architettura distribuita client/server per coordinare in tempo reale le attività di prenotazione, programmazione e vendita.</w:t>
+      </w:r>
+    </w:p>
+    <w:p>
+      <w:r>
+        <w:t xml:space="preserve">Il progetto </w:t>
       </w:r>
       <w:proofErr w:type="spellStart"/>
       <w:r>
+        <w:t>CineMax</w:t>
+      </w:r>
+      <w:proofErr w:type="spellEnd"/>
+      <w:r>
+        <w:t xml:space="preserve"> nasce per rispondere alle esigenze di efficienza e precisione richieste da un moderno complesso cinematografico. Grazie all'interfacciamento tra un server centrale e interfacce client dedicate, il sistema garantisce la sincronizzazione dei dati e la gestione della concorrenza tra i diversi utenti.</w:t>
+      </w:r>
+    </w:p>
+    <w:p>
+      <w:r>
+        <w:rPr>
+          <w:i/>
+          <w:iCs/>
+        </w:rPr>
+        <w:t>Si invita l'utente a consultare i capitoli seguenti per procedere alla corretta configurazione operativa del software.</w:t>
+      </w:r>
+    </w:p>
+    <w:p>
+      <w:pPr>
         <w:rPr>
           <w:b/>
           <w:bCs/>
         </w:rPr>
-        <w:t>CineMax</w:t>
+      </w:pPr>
+    </w:p>
+    <w:p>
+      <w:pPr>
+        <w:pStyle w:val="Titolo2"/>
+      </w:pPr>
+      <w:r>
+        <w:t>1. Requisiti</w:t>
+      </w:r>
+      <w:r>
+        <w:t xml:space="preserve"> di sistema</w:t>
+      </w:r>
+    </w:p>
+    <w:p>
+      <w:r>
+        <w:t>Ambiente di Sviluppo e Compilazione (Build Environment)</w:t>
+      </w:r>
+    </w:p>
+    <w:p>
+      <w:pPr>
+        <w:numPr>
+          <w:ilvl w:val="0"/>
+          <w:numId w:val="9"/>
+        </w:numPr>
+        <w:rPr>
+          <w:lang w:val="en-US"/>
+        </w:rPr>
+      </w:pPr>
+      <w:r>
+        <w:rPr>
+          <w:lang w:val="en-US"/>
+        </w:rPr>
+        <w:t xml:space="preserve">Java Development Kit (JDK): JDK 25 (con </w:t>
+      </w:r>
+      <w:proofErr w:type="spellStart"/>
+      <w:r>
+        <w:rPr>
+          <w:lang w:val="en-US"/>
+        </w:rPr>
+        <w:t>supporto</w:t>
       </w:r>
       <w:proofErr w:type="spellEnd"/>
-    </w:p>
-    <w:p>
-      <w:r>
-        <w:t xml:space="preserve">Benvenuto nell'applicativo </w:t>
+      <w:r>
+        <w:rPr>
+          <w:lang w:val="en-US"/>
+        </w:rPr>
+        <w:t xml:space="preserve"> a 64-bit). </w:t>
+      </w:r>
+    </w:p>
+    <w:p>
+      <w:pPr>
+        <w:numPr>
+          <w:ilvl w:val="0"/>
+          <w:numId w:val="9"/>
+        </w:numPr>
+      </w:pPr>
+      <w:r>
+        <w:t>Build Automation Tool: Apache Maven 3.9.0 o versione successiva.</w:t>
+      </w:r>
+    </w:p>
+    <w:p>
+      <w:pPr>
+        <w:numPr>
+          <w:ilvl w:val="0"/>
+          <w:numId w:val="9"/>
+        </w:numPr>
+      </w:pPr>
+      <w:r>
+        <w:t>Database Management System (DBMS): DBMS relazionale compatibile JDBC (</w:t>
       </w:r>
       <w:proofErr w:type="spellStart"/>
       <w:r>
+        <w:t>PostgreSQL</w:t>
+      </w:r>
+      <w:proofErr w:type="spellEnd"/>
+      <w:r>
+        <w:t>) con driver JDBC configurato tra le dipendenze Maven.</w:t>
+      </w:r>
+    </w:p>
+    <w:p>
+      <w:r>
+        <w:t>Sistema</w:t>
+      </w:r>
+      <w:r>
+        <w:t xml:space="preserve"> operativo: Windows 11, ambiente certificato. </w:t>
+      </w:r>
+    </w:p>
+    <w:p>
+      <w:pPr>
+        <w:rPr>
+          <w:lang w:val="en-US"/>
+        </w:rPr>
+      </w:pPr>
+      <w:r>
+        <w:rPr>
+          <w:lang w:val="en-US"/>
+        </w:rPr>
+        <w:t xml:space="preserve">OpenJDK / Oracle JRE 25 (64-bit) </w:t>
+      </w:r>
+    </w:p>
+    <w:p>
+      <w:pPr>
         <w:rPr>
           <w:b/>
           <w:bCs/>
-        </w:rPr>
-        <w:t>CineMax</w:t>
-      </w:r>
-      <w:proofErr w:type="spellEnd"/>
-      <w:r>
-        <w:t xml:space="preserve">, la soluzione software integrata per la gestione cinematografica sviluppata nell'ambito del </w:t>
-      </w:r>
-      <w:r>
-        <w:rPr>
-          <w:i/>
-          <w:iCs/>
-        </w:rPr>
-        <w:t>Laboratorio Interdisciplinare B</w:t>
-      </w:r>
-      <w:r>
-        <w:t xml:space="preserve"> presso l'Università degli Studi dell'Insubria. Il sistema è stato concepito come un'architettura distribuita client/server per coordinare in tempo reale le attività di prenotazione, programmazione e vendita.</w:t>
-      </w:r>
-    </w:p>
-    <w:p>
-      <w:r>
-        <w:t xml:space="preserve">Il progetto </w:t>
-      </w:r>
-      <w:proofErr w:type="spellStart"/>
-      <w:r>
-        <w:t>CineMax</w:t>
-      </w:r>
-      <w:proofErr w:type="spellEnd"/>
-      <w:r>
-        <w:t xml:space="preserve"> nasce per rispondere alle esigenze di efficienza e precisione richieste da un moderno complesso cinematografico. Grazie all'interfacciamento tra un server centrale e interfacce client dedicate, il sistema garantisce la sincronizzazione dei dati e la gestione della concorrenza tra i diversi utenti.</w:t>
-      </w:r>
-    </w:p>
-    <w:p>
-      <w:r>
-        <w:rPr>
-          <w:i/>
-          <w:iCs/>
-        </w:rPr>
-        <w:t>Si invita l'utente a consultare i capitoli seguenti per procedere alla corretta configurazione operativa del software.</w:t>
-      </w:r>
-    </w:p>
-    <w:p>
-      <w:pPr>
-        <w:rPr>
-          <w:b/>
-          <w:bCs/>
-        </w:rPr>
-      </w:pPr>
-    </w:p>
-    <w:p>
-      <w:pPr>
-        <w:rPr>
-          <w:b/>
-          <w:bCs/>
-        </w:rPr>
-      </w:pPr>
-      <w:r>
-        <w:rPr>
-          <w:b/>
-          <w:bCs/>
-        </w:rPr>
-        <w:t xml:space="preserve">1. </w:t>
-      </w:r>
-      <w:r>
-        <w:rPr>
-          <w:b/>
-          <w:bCs/>
-          <w:highlight w:val="yellow"/>
-        </w:rPr>
-        <w:t>Requisiti</w:t>
-      </w:r>
-      <w:r>
-        <w:rPr>
-          <w:b/>
-          <w:bCs/>
-          <w:highlight w:val="yellow"/>
-        </w:rPr>
-        <w:t xml:space="preserve"> di sistema</w:t>
-      </w:r>
-    </w:p>
-    <w:p>
-      <w:pPr>
-        <w:numPr>
-          <w:ilvl w:val="0"/>
-          <w:numId w:val="1"/>
-        </w:numPr>
-        <w:rPr>
-          <w:highlight w:val="yellow"/>
-        </w:rPr>
-      </w:pPr>
-      <w:r>
-        <w:rPr>
-          <w:b/>
-          <w:bCs/>
-          <w:highlight w:val="yellow"/>
-        </w:rPr>
-        <w:t>Da scrivere</w:t>
-      </w:r>
-    </w:p>
-    <w:p>
-      <w:pPr>
-        <w:rPr>
-          <w:b/>
-          <w:bCs/>
-        </w:rPr>
-      </w:pPr>
-    </w:p>
-    <w:p>
-      <w:pPr>
-        <w:rPr>
-          <w:b/>
-          <w:bCs/>
-        </w:rPr>
-      </w:pPr>
-      <w:r>
-        <w:rPr>
-          <w:b/>
-          <w:bCs/>
-        </w:rPr>
+          <w:lang w:val="en-US"/>
+        </w:rPr>
+      </w:pPr>
+    </w:p>
+    <w:p>
+      <w:pPr>
+        <w:pStyle w:val="Titolo2"/>
+      </w:pPr>
+      <w:r>
         <w:t>2. Installazione e Avvio del Software</w:t>
       </w:r>
     </w:p>
@@ -414,7 +453,38 @@
         </w:numPr>
       </w:pPr>
       <w:r>
-        <w:t>Si prega di aprire una finestra del terminale all'interno della cartella bin.</w:t>
+        <w:t>Si prega di aprire una finestra del terminale</w:t>
+      </w:r>
+      <w:r>
+        <w:t xml:space="preserve">: </w:t>
+      </w:r>
+    </w:p>
+    <w:p>
+      <w:pPr>
+        <w:numPr>
+          <w:ilvl w:val="1"/>
+          <w:numId w:val="2"/>
+        </w:numPr>
+      </w:pPr>
+      <w:r>
+        <w:t xml:space="preserve">Avvia l’eseguibile </w:t>
+      </w:r>
+      <w:r>
+        <w:t>cmd.exe</w:t>
+      </w:r>
+      <w:r>
+        <w:t>,</w:t>
+      </w:r>
+    </w:p>
+    <w:p>
+      <w:pPr>
+        <w:numPr>
+          <w:ilvl w:val="1"/>
+          <w:numId w:val="2"/>
+        </w:numPr>
+      </w:pPr>
+      <w:r>
+        <w:t>Nel prompt dei comandi collocarsi alla cartella bin</w:t>
       </w:r>
     </w:p>
     <w:p>
@@ -462,8 +532,13 @@
         </w:numPr>
       </w:pPr>
       <w:r>
-        <w:lastRenderedPageBreak/>
-        <w:t>Aprire una seconda finestra del terminale e avviare il client: java -</w:t>
+        <w:t>Aprire una seconda finestra del terminale e avviare il cl</w:t>
+      </w:r>
+      <w:r>
+        <w:t>ient</w:t>
+      </w:r>
+      <w:r>
+        <w:t>: java -</w:t>
       </w:r>
       <w:proofErr w:type="spellStart"/>
       <w:r>
@@ -476,23 +551,24 @@
     </w:p>
     <w:p>
       <w:pPr>
+        <w:rPr>
+          <w:b/>
+          <w:bCs/>
+        </w:rPr>
+      </w:pPr>
+    </w:p>
+    <w:p>
+      <w:pPr>
+        <w:pStyle w:val="Titolo2"/>
         <w:rPr>
           <w:i/>
           <w:iCs/>
         </w:rPr>
       </w:pPr>
       <w:r>
-        <w:rPr>
-          <w:b/>
-          <w:bCs/>
-        </w:rPr>
         <w:t xml:space="preserve">3. </w:t>
       </w:r>
       <w:r>
-        <w:rPr>
-          <w:b/>
-          <w:bCs/>
-        </w:rPr>
         <w:t>Schermata iniziale accessibile senza registrazione:</w:t>
       </w:r>
     </w:p>
@@ -647,24 +723,26 @@
         <w:t xml:space="preserve"> - Schermata iniziale</w:t>
       </w:r>
     </w:p>
-    <w:p>
-      <w:pPr>
-        <w:rPr>
-          <w:b/>
-          <w:bCs/>
-        </w:rPr>
-      </w:pPr>
-      <w:r>
-        <w:rPr>
-          <w:b/>
-          <w:bCs/>
-        </w:rPr>
-        <w:t>3. Gestione Account: Registrazione e Login</w:t>
-      </w:r>
-    </w:p>
-    <w:p>
-      <w:r>
-        <w:lastRenderedPageBreak/>
+    <w:p/>
+    <w:p>
+      <w:pPr>
+        <w:pStyle w:val="Titolo2"/>
+      </w:pPr>
+      <w:r>
+        <w:t>4</w:t>
+      </w:r>
+      <w:r>
+        <w:t xml:space="preserve">. Gestione </w:t>
+      </w:r>
+      <w:r>
+        <w:t>Account</w:t>
+      </w:r>
+      <w:r>
+        <w:t>: Registrazione e Login</w:t>
+      </w:r>
+    </w:p>
+    <w:p>
+      <w:r>
         <w:t>Ogni utente del sistema deve possedere un profilo per accedere alle funzioni di propria competenza. Come visibile nel Box di Registrazione, la creazione di un account richiede l'inserimento di dati specifici.</w:t>
       </w:r>
     </w:p>
@@ -843,17 +921,13 @@
     <w:p/>
     <w:p>
       <w:pPr>
-        <w:rPr>
-          <w:b/>
-          <w:bCs/>
-        </w:rPr>
-      </w:pPr>
-      <w:r>
-        <w:rPr>
-          <w:b/>
-          <w:bCs/>
-        </w:rPr>
-        <w:t>4. Guida Operativa per il Cliente</w:t>
+        <w:pStyle w:val="Titolo2"/>
+      </w:pPr>
+      <w:r>
+        <w:t>5</w:t>
+      </w:r>
+      <w:r>
+        <w:t>. Guida Operativa per il Cliente</w:t>
       </w:r>
     </w:p>
     <w:p>
@@ -861,25 +935,18 @@
         <w:t>Il modulo Cliente consente di consultare il catalogo film, gestire le proprie prenotazioni e riservare posti per le proiezioni future.</w:t>
       </w:r>
     </w:p>
-    <w:p>
-      <w:pPr>
-        <w:rPr>
-          <w:b/>
-          <w:bCs/>
-        </w:rPr>
-      </w:pPr>
-      <w:r>
-        <w:rPr>
-          <w:b/>
-          <w:bCs/>
-        </w:rPr>
-        <w:t xml:space="preserve">4.1 Consultazione </w:t>
-      </w:r>
-      <w:r>
-        <w:rPr>
-          <w:b/>
-          <w:bCs/>
-        </w:rPr>
+    <w:p/>
+    <w:p>
+      <w:pPr>
+        <w:pStyle w:val="Titolo3"/>
+      </w:pPr>
+      <w:r>
+        <w:t>5</w:t>
+      </w:r>
+      <w:r>
+        <w:t xml:space="preserve">.1 Consultazione </w:t>
+      </w:r>
+      <w:r>
         <w:t>delle proiezioni pianificate</w:t>
       </w:r>
     </w:p>
@@ -966,17 +1033,13 @@
     </w:p>
     <w:p>
       <w:pPr>
-        <w:rPr>
-          <w:b/>
-          <w:bCs/>
-        </w:rPr>
-      </w:pPr>
-      <w:r>
-        <w:rPr>
-          <w:b/>
-          <w:bCs/>
-        </w:rPr>
-        <w:t>4.2 Prenotazione Posti</w:t>
+        <w:pStyle w:val="Titolo3"/>
+      </w:pPr>
+      <w:r>
+        <w:t>5</w:t>
+      </w:r>
+      <w:r>
+        <w:t>.2 Prenotazione Posti</w:t>
       </w:r>
     </w:p>
     <w:p>
@@ -1046,7 +1109,6 @@
         <w:rPr>
           <w:noProof/>
         </w:rPr>
-        <w:lastRenderedPageBreak/>
         <w:drawing>
           <wp:inline distT="0" distB="0" distL="0" distR="0" wp14:anchorId="7444732F" wp14:editId="270A08DB">
             <wp:extent cx="6120130" cy="4918075"/>
@@ -1141,17 +1203,13 @@
     </w:p>
     <w:p>
       <w:pPr>
-        <w:rPr>
-          <w:b/>
-          <w:bCs/>
-        </w:rPr>
-      </w:pPr>
-      <w:r>
-        <w:rPr>
-          <w:b/>
-          <w:bCs/>
-        </w:rPr>
-        <w:t>4.3 Le Mie Prenotazioni</w:t>
+        <w:pStyle w:val="Titolo3"/>
+      </w:pPr>
+      <w:r>
+        <w:t>5</w:t>
+      </w:r>
+      <w:r>
+        <w:t>.3 Le Mie Prenotazioni</w:t>
       </w:r>
     </w:p>
     <w:p>
@@ -1421,7 +1479,6 @@
                 <w:b/>
                 <w:bCs/>
               </w:rPr>
-              <w:lastRenderedPageBreak/>
               <w:t>Gestisci</w:t>
             </w:r>
           </w:p>
@@ -1480,17 +1537,13 @@
     </w:p>
     <w:p>
       <w:pPr>
-        <w:rPr>
-          <w:b/>
-          <w:bCs/>
-        </w:rPr>
-      </w:pPr>
-      <w:r>
-        <w:rPr>
-          <w:b/>
-          <w:bCs/>
-        </w:rPr>
-        <w:t>5. Guida Operativa per il Proiezionista</w:t>
+        <w:pStyle w:val="Titolo2"/>
+      </w:pPr>
+      <w:r>
+        <w:t>6</w:t>
+      </w:r>
+      <w:r>
+        <w:t>. Guida Operativa per il Proiezionista</w:t>
       </w:r>
     </w:p>
     <w:p>
@@ -1505,8 +1558,14 @@
       </w:r>
     </w:p>
     <w:p>
-      <w:r>
-        <w:t>5.1 Modifica delle Proiezioni esistenti</w:t>
+      <w:pPr>
+        <w:pStyle w:val="Titolo3"/>
+      </w:pPr>
+      <w:r>
+        <w:t>6</w:t>
+      </w:r>
+      <w:r>
+        <w:t>.1 Modifica delle Proiezioni esistenti</w:t>
       </w:r>
     </w:p>
     <w:p>
@@ -1526,19 +1585,13 @@
         <w:t>di ricerca</w:t>
       </w:r>
       <w:r>
-        <w:t xml:space="preserve"> delle</w:t>
-      </w:r>
-      <w:r>
-        <w:t xml:space="preserve"> proiezioni</w:t>
+        <w:t xml:space="preserve"> delle proiezioni</w:t>
       </w:r>
       <w:r>
         <w:t xml:space="preserve">, </w:t>
       </w:r>
       <w:r>
-        <w:t xml:space="preserve">il </w:t>
-      </w:r>
-      <w:r>
-        <w:t>Proiezionista</w:t>
+        <w:t>il Proiezionista</w:t>
       </w:r>
       <w:r>
         <w:t xml:space="preserve"> può filtrare le proiezioni secondo due modalità distinte</w:t>
@@ -1630,30 +1683,18 @@
     </w:p>
     <w:p>
       <w:pPr>
-        <w:rPr>
-          <w:b/>
-          <w:bCs/>
-        </w:rPr>
-      </w:pPr>
-      <w:r>
-        <w:rPr>
-          <w:b/>
-          <w:bCs/>
-        </w:rPr>
-        <w:t>5.</w:t>
-      </w:r>
-      <w:r>
-        <w:rPr>
-          <w:b/>
-          <w:bCs/>
-        </w:rPr>
+        <w:pStyle w:val="Titolo3"/>
+      </w:pPr>
+      <w:r>
+        <w:t>6</w:t>
+      </w:r>
+      <w:r>
+        <w:t>.</w:t>
+      </w:r>
+      <w:r>
         <w:t>2</w:t>
       </w:r>
       <w:r>
-        <w:rPr>
-          <w:b/>
-          <w:bCs/>
-        </w:rPr>
         <w:t xml:space="preserve"> Inserimento Nuova Proiezione</w:t>
       </w:r>
     </w:p>
@@ -1749,7 +1790,6 @@
         <w:rPr>
           <w:noProof/>
         </w:rPr>
-        <w:lastRenderedPageBreak/>
         <w:drawing>
           <wp:inline distT="0" distB="0" distL="0" distR="0" wp14:anchorId="09E3D617" wp14:editId="0E4DD54F">
             <wp:extent cx="6120130" cy="4899660"/>
@@ -1803,17 +1843,13 @@
     </w:p>
     <w:p>
       <w:pPr>
-        <w:rPr>
-          <w:b/>
-          <w:bCs/>
-        </w:rPr>
-      </w:pPr>
-      <w:r>
-        <w:rPr>
-          <w:b/>
-          <w:bCs/>
-        </w:rPr>
-        <w:t>5.3 Storico delle proiezioni:</w:t>
+        <w:pStyle w:val="Titolo3"/>
+      </w:pPr>
+      <w:r>
+        <w:t>6</w:t>
+      </w:r>
+      <w:r>
+        <w:t>.3 Storico delle proiezioni:</w:t>
       </w:r>
     </w:p>
     <w:p>
@@ -1824,7 +1860,6 @@
         <w:rPr>
           <w:noProof/>
         </w:rPr>
-        <w:lastRenderedPageBreak/>
         <w:drawing>
           <wp:inline distT="0" distB="0" distL="0" distR="0" wp14:anchorId="0EE987FA" wp14:editId="1002A629">
             <wp:extent cx="6120130" cy="4949190"/>
@@ -1878,30 +1913,18 @@
     </w:p>
     <w:p>
       <w:pPr>
-        <w:rPr>
-          <w:b/>
-          <w:bCs/>
-        </w:rPr>
-      </w:pPr>
-      <w:r>
-        <w:rPr>
-          <w:b/>
-          <w:bCs/>
-        </w:rPr>
-        <w:t>5.</w:t>
-      </w:r>
-      <w:r>
-        <w:rPr>
-          <w:b/>
-          <w:bCs/>
-        </w:rPr>
+        <w:pStyle w:val="Titolo3"/>
+      </w:pPr>
+      <w:r>
+        <w:t>6</w:t>
+      </w:r>
+      <w:r>
+        <w:t>.</w:t>
+      </w:r>
+      <w:r>
         <w:t>4</w:t>
       </w:r>
       <w:r>
-        <w:rPr>
-          <w:b/>
-          <w:bCs/>
-        </w:rPr>
         <w:t xml:space="preserve"> Tipologie di Gestione</w:t>
       </w:r>
     </w:p>
@@ -2174,21 +2197,12 @@
     </w:p>
     <w:p>
       <w:pPr>
-        <w:pStyle w:val="Paragrafoelenco"/>
-        <w:numPr>
-          <w:ilvl w:val="0"/>
-          <w:numId w:val="2"/>
-        </w:numPr>
-        <w:rPr>
-          <w:b/>
-          <w:bCs/>
-        </w:rPr>
-      </w:pPr>
-      <w:r>
-        <w:rPr>
-          <w:b/>
-          <w:bCs/>
-        </w:rPr>
+        <w:pStyle w:val="Titolo2"/>
+      </w:pPr>
+      <w:r>
+        <w:t xml:space="preserve">7. </w:t>
+      </w:r>
+      <w:r>
         <w:t>Guida Operativa per il Bigliettaio</w:t>
       </w:r>
     </w:p>
@@ -2200,11 +2214,7 @@
         <w:t>Le funzioni principali del bigliettaio sono in consultazione: nella schermata “Ricerca prenotazioni” può ricercare le prenotazioni in base al codice della prenotazione, al nome e cognome del cliente, al titolo di film e a un range di date (tra data e data, entro una certa data, oltre una certa data).</w:t>
       </w:r>
       <w:r>
-        <w:t xml:space="preserve"> Selezionando una prenotazione è possibile visionare i dettagli della </w:t>
-      </w:r>
-      <w:r>
-        <w:lastRenderedPageBreak/>
-        <w:t>prenotazione e della proiezione a cui si riferisce.</w:t>
+        <w:t xml:space="preserve"> Selezionando una prenotazione è possibile visionare i dettagli della prenotazione e della proiezione a cui si riferisce.</w:t>
       </w:r>
       <w:r>
         <w:rPr>
@@ -2290,7 +2300,6 @@
         <w:rPr>
           <w:noProof/>
         </w:rPr>
-        <w:lastRenderedPageBreak/>
         <w:drawing>
           <wp:inline distT="0" distB="0" distL="0" distR="0" wp14:anchorId="7253B6BF" wp14:editId="5271A915">
             <wp:extent cx="6120130" cy="4937125"/>
@@ -2352,23 +2361,15 @@
     </w:p>
     <w:p>
       <w:pPr>
-        <w:rPr>
-          <w:b/>
-          <w:bCs/>
-        </w:rPr>
-      </w:pPr>
-      <w:r>
-        <w:rPr>
-          <w:b/>
-          <w:bCs/>
-        </w:rPr>
-        <w:t xml:space="preserve">7. </w:t>
-      </w:r>
-      <w:r>
-        <w:rPr>
-          <w:b/>
-          <w:bCs/>
-        </w:rPr>
+        <w:pStyle w:val="Titolo2"/>
+      </w:pPr>
+      <w:r>
+        <w:t>8</w:t>
+      </w:r>
+      <w:r>
+        <w:t xml:space="preserve">. </w:t>
+      </w:r>
+      <w:r>
         <w:t>Sintesi delle funzioni principali:</w:t>
       </w:r>
     </w:p>
@@ -2676,7 +2677,7 @@
 </file>
 
 <file path=word/endnotes.xml><?xml version="1.0" encoding="utf-8"?>
-<w:endnotes xmlns:wpc="http://schemas.microsoft.com/office/word/2010/wordprocessingCanvas" xmlns:cx="http://schemas.microsoft.com/office/drawing/2014/chartex" xmlns:cx1="http://schemas.microsoft.com/office/drawing/2015/9/8/chartex" xmlns:cx2="http://schemas.microsoft.com/office/drawing/2015/10/21/chartex" xmlns:cx3="http://schemas.microsoft.com/office/drawing/2016/5/9/chartex" xmlns:cx4="http://schemas.microsoft.com/office/drawing/2016/5/10/chartex" xmlns:cx5="http://schemas.microsoft.com/office/drawing/2016/5/11/chartex" xmlns:cx6="http://schemas.microsoft.com/office/drawing/2016/5/12/chartex" xmlns:cx7="http://schemas.microsoft.com/office/drawing/2016/5/13/chartex" xmlns:cx8="http://schemas.microsoft.com/office/drawing/2016/5/14/chartex" xmlns:mc="http://schemas.openxmlformats.org/markup-compatibility/2006" xmlns:aink="http://schemas.microsoft.com/office/drawing/2016/ink" xmlns:am3d="http://schemas.microsoft.com/office/drawing/2017/model3d" xmlns:o="urn:schemas-microsoft-com:office:office" xmlns:oel="http://schemas.microsoft.com/office/2019/extlst" xmlns:r="http://schemas.openxmlformats.org/officeDocument/2006/relationships" xmlns:m="http://schemas.openxmlformats.org/officeDocument/2006/math" xmlns:v="urn:schemas-microsoft-com:vml" xmlns:wp14="http://schemas.microsoft.com/office/word/2010/wordprocessingDrawing" xmlns:wp="http://schemas.openxmlformats.org/drawingml/2006/wordprocessingDrawing" xmlns:w10="urn:schemas-microsoft-com:office:word" xmlns:w="http://schemas.openxmlformats.org/wordprocessingml/2006/main" xmlns:w14="http://schemas.microsoft.com/office/word/2010/wordml" xmlns:w15="http://schemas.microsoft.com/office/word/2012/wordml" xmlns:w16cei="http://schemas.microsoft.com/office/word/2026/wordml/cei" xmlns:w16cex="http://schemas.microsoft.com/office/word/2018/wordml/cex" xmlns:w16cid="http://schemas.microsoft.com/office/word/2016/wordml/cid" xmlns:w16="http://schemas.microsoft.com/office/word/2018/wordml" xmlns:w16du="http://schemas.microsoft.com/office/word/2023/wordml/word16du" xmlns:w16sdtdh="http://schemas.microsoft.com/office/word/2020/wordml/sdtdatahash" xmlns:w16sdtfl="http://schemas.microsoft.com/office/word/2024/wordml/sdtformatlock" xmlns:w16se="http://schemas.microsoft.com/office/word/2015/wordml/symex" xmlns:wpg="http://schemas.microsoft.com/office/word/2010/wordprocessingGroup" xmlns:wpi="http://schemas.microsoft.com/office/word/2010/wordprocessingInk" xmlns:wne="http://schemas.microsoft.com/office/word/2006/wordml" xmlns:wps="http://schemas.microsoft.com/office/word/2010/wordprocessingShape" mc:Ignorable="w14 w15 w16se w16cid w16 w16cex w16sdtdh w16sdtfl w16du wp14">
+<w:endnotes xmlns:wpc="http://schemas.microsoft.com/office/word/2010/wordprocessingCanvas" xmlns:cx="http://schemas.microsoft.com/office/drawing/2014/chartex" xmlns:cx1="http://schemas.microsoft.com/office/drawing/2015/9/8/chartex" xmlns:cx2="http://schemas.microsoft.com/office/drawing/2015/10/21/chartex" xmlns:cx3="http://schemas.microsoft.com/office/drawing/2016/5/9/chartex" xmlns:cx4="http://schemas.microsoft.com/office/drawing/2016/5/10/chartex" xmlns:cx5="http://schemas.microsoft.com/office/drawing/2016/5/11/chartex" xmlns:cx6="http://schemas.microsoft.com/office/drawing/2016/5/12/chartex" xmlns:cx7="http://schemas.microsoft.com/office/drawing/2016/5/13/chartex" xmlns:cx8="http://schemas.microsoft.com/office/drawing/2016/5/14/chartex" xmlns:mc="http://schemas.openxmlformats.org/markup-compatibility/2006" xmlns:aink="http://schemas.microsoft.com/office/drawing/2016/ink" xmlns:am3d="http://schemas.microsoft.com/office/drawing/2017/model3d" xmlns:o="urn:schemas-microsoft-com:office:office" xmlns:oel="http://schemas.microsoft.com/office/2019/extlst" xmlns:r="http://schemas.openxmlformats.org/officeDocument/2006/relationships" xmlns:m="http://schemas.openxmlformats.org/officeDocument/2006/math" xmlns:v="urn:schemas-microsoft-com:vml" xmlns:wp14="http://schemas.microsoft.com/office/word/2010/wordprocessingDrawing" xmlns:wp="http://schemas.openxmlformats.org/drawingml/2006/wordprocessingDrawing" xmlns:w10="urn:schemas-microsoft-com:office:word" xmlns:w="http://schemas.openxmlformats.org/wordprocessingml/2006/main" xmlns:w14="http://schemas.microsoft.com/office/word/2010/wordml" xmlns:w15="http://schemas.microsoft.com/office/word/2012/wordml" xmlns:w16cex="http://schemas.microsoft.com/office/word/2018/wordml/cex" xmlns:w16cid="http://schemas.microsoft.com/office/word/2016/wordml/cid" xmlns:w16="http://schemas.microsoft.com/office/word/2018/wordml" xmlns:w16du="http://schemas.microsoft.com/office/word/2023/wordml/word16du" xmlns:w16sdtdh="http://schemas.microsoft.com/office/word/2020/wordml/sdtdatahash" xmlns:w16sdtfl="http://schemas.microsoft.com/office/word/2024/wordml/sdtformatlock" xmlns:w16se="http://schemas.microsoft.com/office/word/2015/wordml/symex" xmlns:wpg="http://schemas.microsoft.com/office/word/2010/wordprocessingGroup" xmlns:wpi="http://schemas.microsoft.com/office/word/2010/wordprocessingInk" xmlns:wne="http://schemas.microsoft.com/office/word/2006/wordml" xmlns:wps="http://schemas.microsoft.com/office/word/2010/wordprocessingShape" mc:Ignorable="w14 w15 w16se w16cid w16 w16cex w16sdtdh w16sdtfl w16du wp14">
   <w:endnote w:type="separator" w:id="-1">
     <w:p>
       <w:pPr>
@@ -2701,7 +2702,7 @@
 </file>
 
 <file path=word/footnotes.xml><?xml version="1.0" encoding="utf-8"?>
-<w:footnotes xmlns:wpc="http://schemas.microsoft.com/office/word/2010/wordprocessingCanvas" xmlns:cx="http://schemas.microsoft.com/office/drawing/2014/chartex" xmlns:cx1="http://schemas.microsoft.com/office/drawing/2015/9/8/chartex" xmlns:cx2="http://schemas.microsoft.com/office/drawing/2015/10/21/chartex" xmlns:cx3="http://schemas.microsoft.com/office/drawing/2016/5/9/chartex" xmlns:cx4="http://schemas.microsoft.com/office/drawing/2016/5/10/chartex" xmlns:cx5="http://schemas.microsoft.com/office/drawing/2016/5/11/chartex" xmlns:cx6="http://schemas.microsoft.com/office/drawing/2016/5/12/chartex" xmlns:cx7="http://schemas.microsoft.com/office/drawing/2016/5/13/chartex" xmlns:cx8="http://schemas.microsoft.com/office/drawing/2016/5/14/chartex" xmlns:mc="http://schemas.openxmlformats.org/markup-compatibility/2006" xmlns:aink="http://schemas.microsoft.com/office/drawing/2016/ink" xmlns:am3d="http://schemas.microsoft.com/office/drawing/2017/model3d" xmlns:o="urn:schemas-microsoft-com:office:office" xmlns:oel="http://schemas.microsoft.com/office/2019/extlst" xmlns:r="http://schemas.openxmlformats.org/officeDocument/2006/relationships" xmlns:m="http://schemas.openxmlformats.org/officeDocument/2006/math" xmlns:v="urn:schemas-microsoft-com:vml" xmlns:wp14="http://schemas.microsoft.com/office/word/2010/wordprocessingDrawing" xmlns:wp="http://schemas.openxmlformats.org/drawingml/2006/wordprocessingDrawing" xmlns:w10="urn:schemas-microsoft-com:office:word" xmlns:w="http://schemas.openxmlformats.org/wordprocessingml/2006/main" xmlns:w14="http://schemas.microsoft.com/office/word/2010/wordml" xmlns:w15="http://schemas.microsoft.com/office/word/2012/wordml" xmlns:w16cei="http://schemas.microsoft.com/office/word/2026/wordml/cei" xmlns:w16cex="http://schemas.microsoft.com/office/word/2018/wordml/cex" xmlns:w16cid="http://schemas.microsoft.com/office/word/2016/wordml/cid" xmlns:w16="http://schemas.microsoft.com/office/word/2018/wordml" xmlns:w16du="http://schemas.microsoft.com/office/word/2023/wordml/word16du" xmlns:w16sdtdh="http://schemas.microsoft.com/office/word/2020/wordml/sdtdatahash" xmlns:w16sdtfl="http://schemas.microsoft.com/office/word/2024/wordml/sdtformatlock" xmlns:w16se="http://schemas.microsoft.com/office/word/2015/wordml/symex" xmlns:wpg="http://schemas.microsoft.com/office/word/2010/wordprocessingGroup" xmlns:wpi="http://schemas.microsoft.com/office/word/2010/wordprocessingInk" xmlns:wne="http://schemas.microsoft.com/office/word/2006/wordml" xmlns:wps="http://schemas.microsoft.com/office/word/2010/wordprocessingShape" mc:Ignorable="w14 w15 w16se w16cid w16 w16cex w16sdtdh w16sdtfl w16du wp14">
+<w:footnotes xmlns:wpc="http://schemas.microsoft.com/office/word/2010/wordprocessingCanvas" xmlns:cx="http://schemas.microsoft.com/office/drawing/2014/chartex" xmlns:cx1="http://schemas.microsoft.com/office/drawing/2015/9/8/chartex" xmlns:cx2="http://schemas.microsoft.com/office/drawing/2015/10/21/chartex" xmlns:cx3="http://schemas.microsoft.com/office/drawing/2016/5/9/chartex" xmlns:cx4="http://schemas.microsoft.com/office/drawing/2016/5/10/chartex" xmlns:cx5="http://schemas.microsoft.com/office/drawing/2016/5/11/chartex" xmlns:cx6="http://schemas.microsoft.com/office/drawing/2016/5/12/chartex" xmlns:cx7="http://schemas.microsoft.com/office/drawing/2016/5/13/chartex" xmlns:cx8="http://schemas.microsoft.com/office/drawing/2016/5/14/chartex" xmlns:mc="http://schemas.openxmlformats.org/markup-compatibility/2006" xmlns:aink="http://schemas.microsoft.com/office/drawing/2016/ink" xmlns:am3d="http://schemas.microsoft.com/office/drawing/2017/model3d" xmlns:o="urn:schemas-microsoft-com:office:office" xmlns:oel="http://schemas.microsoft.com/office/2019/extlst" xmlns:r="http://schemas.openxmlformats.org/officeDocument/2006/relationships" xmlns:m="http://schemas.openxmlformats.org/officeDocument/2006/math" xmlns:v="urn:schemas-microsoft-com:vml" xmlns:wp14="http://schemas.microsoft.com/office/word/2010/wordprocessingDrawing" xmlns:wp="http://schemas.openxmlformats.org/drawingml/2006/wordprocessingDrawing" xmlns:w10="urn:schemas-microsoft-com:office:word" xmlns:w="http://schemas.openxmlformats.org/wordprocessingml/2006/main" xmlns:w14="http://schemas.microsoft.com/office/word/2010/wordml" xmlns:w15="http://schemas.microsoft.com/office/word/2012/wordml" xmlns:w16cex="http://schemas.microsoft.com/office/word/2018/wordml/cex" xmlns:w16cid="http://schemas.microsoft.com/office/word/2016/wordml/cid" xmlns:w16="http://schemas.microsoft.com/office/word/2018/wordml" xmlns:w16du="http://schemas.microsoft.com/office/word/2023/wordml/word16du" xmlns:w16sdtdh="http://schemas.microsoft.com/office/word/2020/wordml/sdtdatahash" xmlns:w16sdtfl="http://schemas.microsoft.com/office/word/2024/wordml/sdtformatlock" xmlns:w16se="http://schemas.microsoft.com/office/word/2015/wordml/symex" xmlns:wpg="http://schemas.microsoft.com/office/word/2010/wordprocessingGroup" xmlns:wpi="http://schemas.microsoft.com/office/word/2010/wordprocessingInk" xmlns:wne="http://schemas.microsoft.com/office/word/2006/wordml" xmlns:wps="http://schemas.microsoft.com/office/word/2010/wordprocessingShape" mc:Ignorable="w14 w15 w16se w16cid w16 w16cex w16sdtdh w16sdtfl w16du wp14">
   <w:footnote w:type="separator" w:id="-1">
     <w:p>
       <w:pPr>
@@ -2726,7 +2727,7 @@
 </file>
 
 <file path=word/numbering.xml><?xml version="1.0" encoding="utf-8"?>
-<w:numbering xmlns:wpc="http://schemas.microsoft.com/office/word/2010/wordprocessingCanvas" xmlns:cx="http://schemas.microsoft.com/office/drawing/2014/chartex" xmlns:cx1="http://schemas.microsoft.com/office/drawing/2015/9/8/chartex" xmlns:cx2="http://schemas.microsoft.com/office/drawing/2015/10/21/chartex" xmlns:cx3="http://schemas.microsoft.com/office/drawing/2016/5/9/chartex" xmlns:cx4="http://schemas.microsoft.com/office/drawing/2016/5/10/chartex" xmlns:cx5="http://schemas.microsoft.com/office/drawing/2016/5/11/chartex" xmlns:cx6="http://schemas.microsoft.com/office/drawing/2016/5/12/chartex" xmlns:cx7="http://schemas.microsoft.com/office/drawing/2016/5/13/chartex" xmlns:cx8="http://schemas.microsoft.com/office/drawing/2016/5/14/chartex" xmlns:mc="http://schemas.openxmlformats.org/markup-compatibility/2006" xmlns:aink="http://schemas.microsoft.com/office/drawing/2016/ink" xmlns:am3d="http://schemas.microsoft.com/office/drawing/2017/model3d" xmlns:o="urn:schemas-microsoft-com:office:office" xmlns:oel="http://schemas.microsoft.com/office/2019/extlst" xmlns:r="http://schemas.openxmlformats.org/officeDocument/2006/relationships" xmlns:m="http://schemas.openxmlformats.org/officeDocument/2006/math" xmlns:v="urn:schemas-microsoft-com:vml" xmlns:wp14="http://schemas.microsoft.com/office/word/2010/wordprocessingDrawing" xmlns:wp="http://schemas.openxmlformats.org/drawingml/2006/wordprocessingDrawing" xmlns:w10="urn:schemas-microsoft-com:office:word" xmlns:w="http://schemas.openxmlformats.org/wordprocessingml/2006/main" xmlns:w14="http://schemas.microsoft.com/office/word/2010/wordml" xmlns:w15="http://schemas.microsoft.com/office/word/2012/wordml" xmlns:w16cei="http://schemas.microsoft.com/office/word/2026/wordml/cei" xmlns:w16cex="http://schemas.microsoft.com/office/word/2018/wordml/cex" xmlns:w16cid="http://schemas.microsoft.com/office/word/2016/wordml/cid" xmlns:w16="http://schemas.microsoft.com/office/word/2018/wordml" xmlns:w16du="http://schemas.microsoft.com/office/word/2023/wordml/word16du" xmlns:w16sdtdh="http://schemas.microsoft.com/office/word/2020/wordml/sdtdatahash" xmlns:w16sdtfl="http://schemas.microsoft.com/office/word/2024/wordml/sdtformatlock" xmlns:w16se="http://schemas.microsoft.com/office/word/2015/wordml/symex" xmlns:wpg="http://schemas.microsoft.com/office/word/2010/wordprocessingGroup" xmlns:wpi="http://schemas.microsoft.com/office/word/2010/wordprocessingInk" xmlns:wne="http://schemas.microsoft.com/office/word/2006/wordml" xmlns:wps="http://schemas.microsoft.com/office/word/2010/wordprocessingShape" mc:Ignorable="w14 w15 w16se w16cid w16 w16cex w16sdtdh w16sdtfl w16du wp14">
+<w:numbering xmlns:wpc="http://schemas.microsoft.com/office/word/2010/wordprocessingCanvas" xmlns:cx="http://schemas.microsoft.com/office/drawing/2014/chartex" xmlns:cx1="http://schemas.microsoft.com/office/drawing/2015/9/8/chartex" xmlns:cx2="http://schemas.microsoft.com/office/drawing/2015/10/21/chartex" xmlns:cx3="http://schemas.microsoft.com/office/drawing/2016/5/9/chartex" xmlns:cx4="http://schemas.microsoft.com/office/drawing/2016/5/10/chartex" xmlns:cx5="http://schemas.microsoft.com/office/drawing/2016/5/11/chartex" xmlns:cx6="http://schemas.microsoft.com/office/drawing/2016/5/12/chartex" xmlns:cx7="http://schemas.microsoft.com/office/drawing/2016/5/13/chartex" xmlns:cx8="http://schemas.microsoft.com/office/drawing/2016/5/14/chartex" xmlns:mc="http://schemas.openxmlformats.org/markup-compatibility/2006" xmlns:aink="http://schemas.microsoft.com/office/drawing/2016/ink" xmlns:am3d="http://schemas.microsoft.com/office/drawing/2017/model3d" xmlns:o="urn:schemas-microsoft-com:office:office" xmlns:oel="http://schemas.microsoft.com/office/2019/extlst" xmlns:r="http://schemas.openxmlformats.org/officeDocument/2006/relationships" xmlns:m="http://schemas.openxmlformats.org/officeDocument/2006/math" xmlns:v="urn:schemas-microsoft-com:vml" xmlns:wp14="http://schemas.microsoft.com/office/word/2010/wordprocessingDrawing" xmlns:wp="http://schemas.openxmlformats.org/drawingml/2006/wordprocessingDrawing" xmlns:w10="urn:schemas-microsoft-com:office:word" xmlns:w="http://schemas.openxmlformats.org/wordprocessingml/2006/main" xmlns:w14="http://schemas.microsoft.com/office/word/2010/wordml" xmlns:w15="http://schemas.microsoft.com/office/word/2012/wordml" xmlns:w16cex="http://schemas.microsoft.com/office/word/2018/wordml/cex" xmlns:w16cid="http://schemas.microsoft.com/office/word/2016/wordml/cid" xmlns:w16="http://schemas.microsoft.com/office/word/2018/wordml" xmlns:w16du="http://schemas.microsoft.com/office/word/2023/wordml/word16du" xmlns:w16sdtdh="http://schemas.microsoft.com/office/word/2020/wordml/sdtdatahash" xmlns:w16sdtfl="http://schemas.microsoft.com/office/word/2024/wordml/sdtformatlock" xmlns:w16se="http://schemas.microsoft.com/office/word/2015/wordml/symex" xmlns:wpg="http://schemas.microsoft.com/office/word/2010/wordprocessingGroup" xmlns:wpi="http://schemas.microsoft.com/office/word/2010/wordprocessingInk" xmlns:wne="http://schemas.microsoft.com/office/word/2006/wordml" xmlns:wps="http://schemas.microsoft.com/office/word/2010/wordprocessingShape" mc:Ignorable="w14 w15 w16se w16cid w16 w16cex w16sdtdh w16sdtfl w16du wp14">
   <w:abstractNum w:abstractNumId="0" w15:restartNumberingAfterBreak="0">
     <w:nsid w:val="2FB44AEF"/>
     <w:multiLevelType w:val="multilevel"/>
@@ -3028,117 +3029,239 @@
   <w:abstractNum w:abstractNumId="2" w15:restartNumberingAfterBreak="0">
     <w:nsid w:val="35012B17"/>
     <w:multiLevelType w:val="multilevel"/>
-    <w:tmpl w:val="AC6A034E"/>
+    <w:tmpl w:val="0410001F"/>
     <w:lvl w:ilvl="0">
       <w:start w:val="1"/>
       <w:numFmt w:val="decimal"/>
       <w:lvlText w:val="%1."/>
       <w:lvlJc w:val="left"/>
       <w:pPr>
-        <w:tabs>
-          <w:tab w:val="num" w:pos="720"/>
-        </w:tabs>
-        <w:ind w:left="720" w:hanging="360"/>
-      </w:pPr>
-    </w:lvl>
-    <w:lvl w:ilvl="1" w:tentative="1">
+        <w:ind w:left="360" w:hanging="360"/>
+      </w:pPr>
+    </w:lvl>
+    <w:lvl w:ilvl="1">
       <w:start w:val="1"/>
       <w:numFmt w:val="decimal"/>
-      <w:lvlText w:val="%2."/>
-      <w:lvlJc w:val="left"/>
-      <w:pPr>
-        <w:tabs>
-          <w:tab w:val="num" w:pos="1440"/>
-        </w:tabs>
-        <w:ind w:left="1440" w:hanging="360"/>
-      </w:pPr>
-    </w:lvl>
-    <w:lvl w:ilvl="2" w:tentative="1">
+      <w:lvlText w:val="%1.%2."/>
+      <w:lvlJc w:val="left"/>
+      <w:pPr>
+        <w:ind w:left="792" w:hanging="432"/>
+      </w:pPr>
+    </w:lvl>
+    <w:lvl w:ilvl="2">
       <w:start w:val="1"/>
       <w:numFmt w:val="decimal"/>
-      <w:lvlText w:val="%3."/>
-      <w:lvlJc w:val="left"/>
-      <w:pPr>
-        <w:tabs>
-          <w:tab w:val="num" w:pos="2160"/>
-        </w:tabs>
-        <w:ind w:left="2160" w:hanging="360"/>
-      </w:pPr>
-    </w:lvl>
-    <w:lvl w:ilvl="3" w:tentative="1">
+      <w:lvlText w:val="%1.%2.%3."/>
+      <w:lvlJc w:val="left"/>
+      <w:pPr>
+        <w:ind w:left="1224" w:hanging="504"/>
+      </w:pPr>
+    </w:lvl>
+    <w:lvl w:ilvl="3">
       <w:start w:val="1"/>
       <w:numFmt w:val="decimal"/>
-      <w:lvlText w:val="%4."/>
-      <w:lvlJc w:val="left"/>
-      <w:pPr>
-        <w:tabs>
-          <w:tab w:val="num" w:pos="2880"/>
-        </w:tabs>
-        <w:ind w:left="2880" w:hanging="360"/>
-      </w:pPr>
-    </w:lvl>
-    <w:lvl w:ilvl="4" w:tentative="1">
+      <w:lvlText w:val="%1.%2.%3.%4."/>
+      <w:lvlJc w:val="left"/>
+      <w:pPr>
+        <w:ind w:left="1728" w:hanging="648"/>
+      </w:pPr>
+    </w:lvl>
+    <w:lvl w:ilvl="4">
       <w:start w:val="1"/>
       <w:numFmt w:val="decimal"/>
-      <w:lvlText w:val="%5."/>
-      <w:lvlJc w:val="left"/>
-      <w:pPr>
-        <w:tabs>
-          <w:tab w:val="num" w:pos="3600"/>
-        </w:tabs>
-        <w:ind w:left="3600" w:hanging="360"/>
-      </w:pPr>
-    </w:lvl>
-    <w:lvl w:ilvl="5" w:tentative="1">
+      <w:lvlText w:val="%1.%2.%3.%4.%5."/>
+      <w:lvlJc w:val="left"/>
+      <w:pPr>
+        <w:ind w:left="2232" w:hanging="792"/>
+      </w:pPr>
+    </w:lvl>
+    <w:lvl w:ilvl="5">
       <w:start w:val="1"/>
       <w:numFmt w:val="decimal"/>
-      <w:lvlText w:val="%6."/>
-      <w:lvlJc w:val="left"/>
-      <w:pPr>
-        <w:tabs>
-          <w:tab w:val="num" w:pos="4320"/>
-        </w:tabs>
-        <w:ind w:left="4320" w:hanging="360"/>
-      </w:pPr>
-    </w:lvl>
-    <w:lvl w:ilvl="6" w:tentative="1">
+      <w:lvlText w:val="%1.%2.%3.%4.%5.%6."/>
+      <w:lvlJc w:val="left"/>
+      <w:pPr>
+        <w:ind w:left="2736" w:hanging="936"/>
+      </w:pPr>
+    </w:lvl>
+    <w:lvl w:ilvl="6">
       <w:start w:val="1"/>
       <w:numFmt w:val="decimal"/>
-      <w:lvlText w:val="%7."/>
-      <w:lvlJc w:val="left"/>
-      <w:pPr>
-        <w:tabs>
-          <w:tab w:val="num" w:pos="5040"/>
-        </w:tabs>
-        <w:ind w:left="5040" w:hanging="360"/>
-      </w:pPr>
-    </w:lvl>
-    <w:lvl w:ilvl="7" w:tentative="1">
+      <w:lvlText w:val="%1.%2.%3.%4.%5.%6.%7."/>
+      <w:lvlJc w:val="left"/>
+      <w:pPr>
+        <w:ind w:left="3240" w:hanging="1080"/>
+      </w:pPr>
+    </w:lvl>
+    <w:lvl w:ilvl="7">
       <w:start w:val="1"/>
       <w:numFmt w:val="decimal"/>
-      <w:lvlText w:val="%8."/>
-      <w:lvlJc w:val="left"/>
-      <w:pPr>
-        <w:tabs>
-          <w:tab w:val="num" w:pos="5760"/>
-        </w:tabs>
-        <w:ind w:left="5760" w:hanging="360"/>
-      </w:pPr>
-    </w:lvl>
-    <w:lvl w:ilvl="8" w:tentative="1">
+      <w:lvlText w:val="%1.%2.%3.%4.%5.%6.%7.%8."/>
+      <w:lvlJc w:val="left"/>
+      <w:pPr>
+        <w:ind w:left="3744" w:hanging="1224"/>
+      </w:pPr>
+    </w:lvl>
+    <w:lvl w:ilvl="8">
       <w:start w:val="1"/>
       <w:numFmt w:val="decimal"/>
-      <w:lvlText w:val="%9."/>
-      <w:lvlJc w:val="left"/>
-      <w:pPr>
-        <w:tabs>
-          <w:tab w:val="num" w:pos="6480"/>
-        </w:tabs>
-        <w:ind w:left="6480" w:hanging="360"/>
+      <w:lvlText w:val="%1.%2.%3.%4.%5.%6.%7.%8.%9."/>
+      <w:lvlJc w:val="left"/>
+      <w:pPr>
+        <w:ind w:left="4320" w:hanging="1440"/>
       </w:pPr>
     </w:lvl>
   </w:abstractNum>
   <w:abstractNum w:abstractNumId="3" w15:restartNumberingAfterBreak="0">
+    <w:nsid w:val="3A035518"/>
+    <w:multiLevelType w:val="multilevel"/>
+    <w:tmpl w:val="884EB8F4"/>
+    <w:lvl w:ilvl="0">
+      <w:start w:val="1"/>
+      <w:numFmt w:val="bullet"/>
+      <w:lvlText w:val=""/>
+      <w:lvlJc w:val="left"/>
+      <w:pPr>
+        <w:tabs>
+          <w:tab w:val="num" w:pos="720"/>
+        </w:tabs>
+        <w:ind w:left="720" w:hanging="360"/>
+      </w:pPr>
+      <w:rPr>
+        <w:rFonts w:ascii="Symbol" w:hAnsi="Symbol" w:hint="default"/>
+        <w:sz w:val="20"/>
+      </w:rPr>
+    </w:lvl>
+    <w:lvl w:ilvl="1" w:tentative="1">
+      <w:start w:val="1"/>
+      <w:numFmt w:val="bullet"/>
+      <w:lvlText w:val="o"/>
+      <w:lvlJc w:val="left"/>
+      <w:pPr>
+        <w:tabs>
+          <w:tab w:val="num" w:pos="1440"/>
+        </w:tabs>
+        <w:ind w:left="1440" w:hanging="360"/>
+      </w:pPr>
+      <w:rPr>
+        <w:rFonts w:ascii="Courier New" w:hAnsi="Courier New" w:hint="default"/>
+        <w:sz w:val="20"/>
+      </w:rPr>
+    </w:lvl>
+    <w:lvl w:ilvl="2" w:tentative="1">
+      <w:start w:val="1"/>
+      <w:numFmt w:val="bullet"/>
+      <w:lvlText w:val=""/>
+      <w:lvlJc w:val="left"/>
+      <w:pPr>
+        <w:tabs>
+          <w:tab w:val="num" w:pos="2160"/>
+        </w:tabs>
+        <w:ind w:left="2160" w:hanging="360"/>
+      </w:pPr>
+      <w:rPr>
+        <w:rFonts w:ascii="Wingdings" w:hAnsi="Wingdings" w:hint="default"/>
+        <w:sz w:val="20"/>
+      </w:rPr>
+    </w:lvl>
+    <w:lvl w:ilvl="3" w:tentative="1">
+      <w:start w:val="1"/>
+      <w:numFmt w:val="bullet"/>
+      <w:lvlText w:val=""/>
+      <w:lvlJc w:val="left"/>
+      <w:pPr>
+        <w:tabs>
+          <w:tab w:val="num" w:pos="2880"/>
+        </w:tabs>
+        <w:ind w:left="2880" w:hanging="360"/>
+      </w:pPr>
+      <w:rPr>
+        <w:rFonts w:ascii="Wingdings" w:hAnsi="Wingdings" w:hint="default"/>
+        <w:sz w:val="20"/>
+      </w:rPr>
+    </w:lvl>
+    <w:lvl w:ilvl="4" w:tentative="1">
+      <w:start w:val="1"/>
+      <w:numFmt w:val="bullet"/>
+      <w:lvlText w:val=""/>
+      <w:lvlJc w:val="left"/>
+      <w:pPr>
+        <w:tabs>
+          <w:tab w:val="num" w:pos="3600"/>
+        </w:tabs>
+        <w:ind w:left="3600" w:hanging="360"/>
+      </w:pPr>
+      <w:rPr>
+        <w:rFonts w:ascii="Wingdings" w:hAnsi="Wingdings" w:hint="default"/>
+        <w:sz w:val="20"/>
+      </w:rPr>
+    </w:lvl>
+    <w:lvl w:ilvl="5" w:tentative="1">
+      <w:start w:val="1"/>
+      <w:numFmt w:val="bullet"/>
+      <w:lvlText w:val=""/>
+      <w:lvlJc w:val="left"/>
+      <w:pPr>
+        <w:tabs>
+          <w:tab w:val="num" w:pos="4320"/>
+        </w:tabs>
+        <w:ind w:left="4320" w:hanging="360"/>
+      </w:pPr>
+      <w:rPr>
+        <w:rFonts w:ascii="Wingdings" w:hAnsi="Wingdings" w:hint="default"/>
+        <w:sz w:val="20"/>
+      </w:rPr>
+    </w:lvl>
+    <w:lvl w:ilvl="6" w:tentative="1">
+      <w:start w:val="1"/>
+      <w:numFmt w:val="bullet"/>
+      <w:lvlText w:val=""/>
+      <w:lvlJc w:val="left"/>
+      <w:pPr>
+        <w:tabs>
+          <w:tab w:val="num" w:pos="5040"/>
+        </w:tabs>
+        <w:ind w:left="5040" w:hanging="360"/>
+      </w:pPr>
+      <w:rPr>
+        <w:rFonts w:ascii="Wingdings" w:hAnsi="Wingdings" w:hint="default"/>
+        <w:sz w:val="20"/>
+      </w:rPr>
+    </w:lvl>
+    <w:lvl w:ilvl="7" w:tentative="1">
+      <w:start w:val="1"/>
+      <w:numFmt w:val="bullet"/>
+      <w:lvlText w:val=""/>
+      <w:lvlJc w:val="left"/>
+      <w:pPr>
+        <w:tabs>
+          <w:tab w:val="num" w:pos="5760"/>
+        </w:tabs>
+        <w:ind w:left="5760" w:hanging="360"/>
+      </w:pPr>
+      <w:rPr>
+        <w:rFonts w:ascii="Wingdings" w:hAnsi="Wingdings" w:hint="default"/>
+        <w:sz w:val="20"/>
+      </w:rPr>
+    </w:lvl>
+    <w:lvl w:ilvl="8" w:tentative="1">
+      <w:start w:val="1"/>
+      <w:numFmt w:val="bullet"/>
+      <w:lvlText w:val=""/>
+      <w:lvlJc w:val="left"/>
+      <w:pPr>
+        <w:tabs>
+          <w:tab w:val="num" w:pos="6480"/>
+        </w:tabs>
+        <w:ind w:left="6480" w:hanging="360"/>
+      </w:pPr>
+      <w:rPr>
+        <w:rFonts w:ascii="Wingdings" w:hAnsi="Wingdings" w:hint="default"/>
+        <w:sz w:val="20"/>
+      </w:rPr>
+    </w:lvl>
+  </w:abstractNum>
+  <w:abstractNum w:abstractNumId="4" w15:restartNumberingAfterBreak="0">
     <w:nsid w:val="41396B84"/>
     <w:multiLevelType w:val="multilevel"/>
     <w:tmpl w:val="E10C4E20"/>
@@ -3251,7 +3374,96 @@
       </w:pPr>
     </w:lvl>
   </w:abstractNum>
-  <w:abstractNum w:abstractNumId="4" w15:restartNumberingAfterBreak="0">
+  <w:abstractNum w:abstractNumId="5" w15:restartNumberingAfterBreak="0">
+    <w:nsid w:val="495D2C99"/>
+    <w:multiLevelType w:val="hybridMultilevel"/>
+    <w:tmpl w:val="87646AD6"/>
+    <w:lvl w:ilvl="0" w:tplc="0410000F">
+      <w:start w:val="7"/>
+      <w:numFmt w:val="decimal"/>
+      <w:lvlText w:val="%1."/>
+      <w:lvlJc w:val="left"/>
+      <w:pPr>
+        <w:ind w:left="720" w:hanging="360"/>
+      </w:pPr>
+      <w:rPr>
+        <w:rFonts w:hint="default"/>
+      </w:rPr>
+    </w:lvl>
+    <w:lvl w:ilvl="1" w:tplc="04100019" w:tentative="1">
+      <w:start w:val="1"/>
+      <w:numFmt w:val="lowerLetter"/>
+      <w:lvlText w:val="%2."/>
+      <w:lvlJc w:val="left"/>
+      <w:pPr>
+        <w:ind w:left="1440" w:hanging="360"/>
+      </w:pPr>
+    </w:lvl>
+    <w:lvl w:ilvl="2" w:tplc="0410001B" w:tentative="1">
+      <w:start w:val="1"/>
+      <w:numFmt w:val="lowerRoman"/>
+      <w:lvlText w:val="%3."/>
+      <w:lvlJc w:val="right"/>
+      <w:pPr>
+        <w:ind w:left="2160" w:hanging="180"/>
+      </w:pPr>
+    </w:lvl>
+    <w:lvl w:ilvl="3" w:tplc="0410000F" w:tentative="1">
+      <w:start w:val="1"/>
+      <w:numFmt w:val="decimal"/>
+      <w:lvlText w:val="%4."/>
+      <w:lvlJc w:val="left"/>
+      <w:pPr>
+        <w:ind w:left="2880" w:hanging="360"/>
+      </w:pPr>
+    </w:lvl>
+    <w:lvl w:ilvl="4" w:tplc="04100019" w:tentative="1">
+      <w:start w:val="1"/>
+      <w:numFmt w:val="lowerLetter"/>
+      <w:lvlText w:val="%5."/>
+      <w:lvlJc w:val="left"/>
+      <w:pPr>
+        <w:ind w:left="3600" w:hanging="360"/>
+      </w:pPr>
+    </w:lvl>
+    <w:lvl w:ilvl="5" w:tplc="0410001B" w:tentative="1">
+      <w:start w:val="1"/>
+      <w:numFmt w:val="lowerRoman"/>
+      <w:lvlText w:val="%6."/>
+      <w:lvlJc w:val="right"/>
+      <w:pPr>
+        <w:ind w:left="4320" w:hanging="180"/>
+      </w:pPr>
+    </w:lvl>
+    <w:lvl w:ilvl="6" w:tplc="0410000F" w:tentative="1">
+      <w:start w:val="1"/>
+      <w:numFmt w:val="decimal"/>
+      <w:lvlText w:val="%7."/>
+      <w:lvlJc w:val="left"/>
+      <w:pPr>
+        <w:ind w:left="5040" w:hanging="360"/>
+      </w:pPr>
+    </w:lvl>
+    <w:lvl w:ilvl="7" w:tplc="04100019" w:tentative="1">
+      <w:start w:val="1"/>
+      <w:numFmt w:val="lowerLetter"/>
+      <w:lvlText w:val="%8."/>
+      <w:lvlJc w:val="left"/>
+      <w:pPr>
+        <w:ind w:left="5760" w:hanging="360"/>
+      </w:pPr>
+    </w:lvl>
+    <w:lvl w:ilvl="8" w:tplc="0410001B" w:tentative="1">
+      <w:start w:val="1"/>
+      <w:numFmt w:val="lowerRoman"/>
+      <w:lvlText w:val="%9."/>
+      <w:lvlJc w:val="right"/>
+      <w:pPr>
+        <w:ind w:left="6480" w:hanging="180"/>
+      </w:pPr>
+    </w:lvl>
+  </w:abstractNum>
+  <w:abstractNum w:abstractNumId="6" w15:restartNumberingAfterBreak="0">
     <w:nsid w:val="5AD561F0"/>
     <w:multiLevelType w:val="multilevel"/>
     <w:tmpl w:val="F52C1F8E"/>
@@ -3400,7 +3612,7 @@
       </w:rPr>
     </w:lvl>
   </w:abstractNum>
-  <w:abstractNum w:abstractNumId="5" w15:restartNumberingAfterBreak="0">
+  <w:abstractNum w:abstractNumId="7" w15:restartNumberingAfterBreak="0">
     <w:nsid w:val="65634FB7"/>
     <w:multiLevelType w:val="multilevel"/>
     <w:tmpl w:val="B3BCCBE0"/>
@@ -3513,7 +3725,7 @@
       </w:pPr>
     </w:lvl>
   </w:abstractNum>
-  <w:abstractNum w:abstractNumId="6" w15:restartNumberingAfterBreak="0">
+  <w:abstractNum w:abstractNumId="8" w15:restartNumberingAfterBreak="0">
     <w:nsid w:val="6D517DE0"/>
     <w:multiLevelType w:val="multilevel"/>
     <w:tmpl w:val="A7888786"/>
@@ -3662,7 +3874,7 @@
       </w:rPr>
     </w:lvl>
   </w:abstractNum>
-  <w:abstractNum w:abstractNumId="7" w15:restartNumberingAfterBreak="0">
+  <w:abstractNum w:abstractNumId="9" w15:restartNumberingAfterBreak="0">
     <w:nsid w:val="6FE97F50"/>
     <w:multiLevelType w:val="multilevel"/>
     <w:tmpl w:val="DF7668F4"/>
@@ -3812,28 +4024,34 @@
     </w:lvl>
   </w:abstractNum>
   <w:num w:numId="1" w16cid:durableId="1876042782">
-    <w:abstractNumId w:val="7"/>
+    <w:abstractNumId w:val="9"/>
   </w:num>
   <w:num w:numId="2" w16cid:durableId="217787136">
     <w:abstractNumId w:val="2"/>
   </w:num>
   <w:num w:numId="3" w16cid:durableId="149490650">
-    <w:abstractNumId w:val="4"/>
+    <w:abstractNumId w:val="6"/>
   </w:num>
   <w:num w:numId="4" w16cid:durableId="1621306232">
-    <w:abstractNumId w:val="6"/>
+    <w:abstractNumId w:val="8"/>
   </w:num>
   <w:num w:numId="5" w16cid:durableId="2561973">
-    <w:abstractNumId w:val="5"/>
+    <w:abstractNumId w:val="7"/>
   </w:num>
   <w:num w:numId="6" w16cid:durableId="1629238822">
     <w:abstractNumId w:val="0"/>
   </w:num>
   <w:num w:numId="7" w16cid:durableId="1395858924">
-    <w:abstractNumId w:val="3"/>
+    <w:abstractNumId w:val="4"/>
   </w:num>
   <w:num w:numId="8" w16cid:durableId="471408874">
     <w:abstractNumId w:val="1"/>
+  </w:num>
+  <w:num w:numId="9" w16cid:durableId="1987011503">
+    <w:abstractNumId w:val="3"/>
+  </w:num>
+  <w:num w:numId="10" w16cid:durableId="1286234870">
+    <w:abstractNumId w:val="5"/>
   </w:num>
 </w:numbering>
 </file>
@@ -4266,7 +4484,6 @@
     <w:next w:val="Normale"/>
     <w:link w:val="Titolo2Carattere"/>
     <w:uiPriority w:val="9"/>
-    <w:semiHidden/>
     <w:unhideWhenUsed/>
     <w:qFormat/>
     <w:rsid w:val="00920552"/>
@@ -4289,7 +4506,6 @@
     <w:next w:val="Normale"/>
     <w:link w:val="Titolo3Carattere"/>
     <w:uiPriority w:val="9"/>
-    <w:semiHidden/>
     <w:unhideWhenUsed/>
     <w:qFormat/>
     <w:rsid w:val="00920552"/>
@@ -4482,7 +4698,6 @@
     <w:basedOn w:val="Carpredefinitoparagrafo"/>
     <w:link w:val="Titolo2"/>
     <w:uiPriority w:val="9"/>
-    <w:semiHidden/>
     <w:rsid w:val="00920552"/>
     <w:rPr>
       <w:rFonts w:asciiTheme="majorHAnsi" w:eastAsiaTheme="majorEastAsia" w:hAnsiTheme="majorHAnsi" w:cstheme="majorBidi"/>
@@ -4496,7 +4711,6 @@
     <w:basedOn w:val="Carpredefinitoparagrafo"/>
     <w:link w:val="Titolo3"/>
     <w:uiPriority w:val="9"/>
-    <w:semiHidden/>
     <w:rsid w:val="00920552"/>
     <w:rPr>
       <w:rFonts w:eastAsiaTheme="majorEastAsia" w:cstheme="majorBidi"/>

</xml_diff>

<commit_message>
mini review docs. mini fix
</commit_message>
<xml_diff>
--- a/documentazione/manuale utente cinemax.docx
+++ b/documentazione/manuale utente cinemax.docx
@@ -4,16 +4,11 @@
   <w:body>
     <w:p>
       <w:pPr>
-        <w:pStyle w:val="Titolo1"/>
-      </w:pPr>
-      <w:r>
-        <w:t xml:space="preserve">Manuale Utente Applicativo </w:t>
-      </w:r>
-      <w:proofErr w:type="spellStart"/>
-      <w:r>
-        <w:t>CineMax</w:t>
-      </w:r>
-      <w:proofErr w:type="spellEnd"/>
+        <w:pStyle w:val="Heading1"/>
+      </w:pPr>
+      <w:r>
+        <w:t>Manuale Utente Applicativo CineMax</w:t>
+      </w:r>
     </w:p>
     <w:p>
       <w:pPr>
@@ -27,7 +22,6 @@
       <w:r>
         <w:t xml:space="preserve">Benvenuto nell'applicativo </w:t>
       </w:r>
-      <w:proofErr w:type="spellStart"/>
       <w:r>
         <w:rPr>
           <w:b/>
@@ -35,7 +29,6 @@
         </w:rPr>
         <w:t>CineMax</w:t>
       </w:r>
-      <w:proofErr w:type="spellEnd"/>
       <w:r>
         <w:t xml:space="preserve">, la soluzione software integrata per la gestione cinematografica sviluppata nell'ambito del </w:t>
       </w:r>
@@ -52,15 +45,13 @@
     </w:p>
     <w:p>
       <w:r>
-        <w:t xml:space="preserve">Il progetto </w:t>
-      </w:r>
-      <w:proofErr w:type="spellStart"/>
-      <w:r>
-        <w:t>CineMax</w:t>
-      </w:r>
-      <w:proofErr w:type="spellEnd"/>
-      <w:r>
-        <w:t xml:space="preserve"> nasce per rispondere alle esigenze di efficienza e precisione richieste da un moderno complesso cinematografico. Grazie all'interfacciamento tra un server centrale e interfacce client dedicate, il sistema garantisce la sincronizzazione dei dati e la gestione della concorrenza tra i diversi utenti.</w:t>
+        <w:t xml:space="preserve">Il progetto CineMax nasce per rispondere alle esigenze di efficienza e precisione richieste da un moderno </w:t>
+      </w:r>
+      <w:r>
+        <w:t>sistema distribuito</w:t>
+      </w:r>
+      <w:r>
+        <w:t>. Grazie all'interfacciamento tra un server centrale e interfacce client dedicate, il sistema garantisce la sincronizzazione dei dati e la gestione della concorrenza tra i diversi utenti.</w:t>
       </w:r>
     </w:p>
     <w:p>
@@ -82,7 +73,7 @@
     </w:p>
     <w:p>
       <w:pPr>
-        <w:pStyle w:val="Titolo2"/>
+        <w:pStyle w:val="Heading2"/>
       </w:pPr>
       <w:r>
         <w:t>1. Requisiti</w:t>
@@ -110,21 +101,7 @@
         <w:rPr>
           <w:lang w:val="en-US"/>
         </w:rPr>
-        <w:t xml:space="preserve">Java Development Kit (JDK): JDK 25 (con </w:t>
-      </w:r>
-      <w:proofErr w:type="spellStart"/>
-      <w:r>
-        <w:rPr>
-          <w:lang w:val="en-US"/>
-        </w:rPr>
-        <w:t>supporto</w:t>
-      </w:r>
-      <w:proofErr w:type="spellEnd"/>
-      <w:r>
-        <w:rPr>
-          <w:lang w:val="en-US"/>
-        </w:rPr>
-        <w:t xml:space="preserve"> a 64-bit). </w:t>
+        <w:t xml:space="preserve">Java Development Kit (JDK): JDK 25 (con supporto a 64-bit). </w:t>
       </w:r>
     </w:p>
     <w:p>
@@ -146,35 +123,16 @@
         </w:numPr>
       </w:pPr>
       <w:r>
-        <w:t>Database Management System (DBMS): DBMS relazionale compatibile JDBC (</w:t>
-      </w:r>
-      <w:proofErr w:type="spellStart"/>
-      <w:r>
-        <w:t>PostgreSQL</w:t>
-      </w:r>
-      <w:proofErr w:type="spellEnd"/>
-      <w:r>
-        <w:t>) con driver JDBC configurato tra le dipendenze Maven.</w:t>
-      </w:r>
-    </w:p>
-    <w:p>
-      <w:r>
-        <w:t>Sistema</w:t>
-      </w:r>
-      <w:r>
-        <w:t xml:space="preserve"> operativo: Windows 11, ambiente certificato. </w:t>
-      </w:r>
-    </w:p>
-    <w:p>
-      <w:pPr>
-        <w:rPr>
-          <w:lang w:val="en-US"/>
-        </w:rPr>
-      </w:pPr>
-      <w:r>
-        <w:rPr>
-          <w:lang w:val="en-US"/>
-        </w:rPr>
+        <w:t>Database Management System (DBMS): DBMS relazionale compatibile JDBC (PostgreSQL) con driver JDBC configurato tra le dipendenze Maven.</w:t>
+      </w:r>
+    </w:p>
+    <w:p>
+      <w:r>
+        <w:t xml:space="preserve">Sistema operativo: Windows 11, ambiente certificato. </w:t>
+      </w:r>
+    </w:p>
+    <w:p>
+      <w:r>
         <w:t xml:space="preserve">OpenJDK / Oracle JRE 25 (64-bit) </w:t>
       </w:r>
     </w:p>
@@ -183,13 +141,12 @@
         <w:rPr>
           <w:b/>
           <w:bCs/>
-          <w:lang w:val="en-US"/>
         </w:rPr>
       </w:pPr>
     </w:p>
     <w:p>
       <w:pPr>
-        <w:pStyle w:val="Titolo2"/>
+        <w:pStyle w:val="Heading2"/>
       </w:pPr>
       <w:r>
         <w:t>2. Installazione e Avvio del Software</w:t>
@@ -197,15 +154,7 @@
     </w:p>
     <w:p>
       <w:r>
-        <w:t xml:space="preserve">L'applicativo </w:t>
-      </w:r>
-      <w:proofErr w:type="spellStart"/>
-      <w:r>
-        <w:t>CineMax</w:t>
-      </w:r>
-      <w:proofErr w:type="spellEnd"/>
-      <w:r>
-        <w:t xml:space="preserve"> è strutturato seguendo lo standard </w:t>
+        <w:t xml:space="preserve">L'applicativo CineMax è strutturato seguendo lo standard </w:t>
       </w:r>
       <w:r>
         <w:rPr>
@@ -220,7 +169,10 @@
     </w:p>
     <w:p>
       <w:r>
-        <w:t>Per stabilire la connessione distribuita, è necessario seguire rigorosamente questo ordine di avvio:</w:t>
+        <w:t>Perché l’applicativo possa funzionare</w:t>
+      </w:r>
+      <w:r>
+        <w:t>, è necessario seguire rigorosamente questo ordine di avvio:</w:t>
       </w:r>
     </w:p>
     <w:tbl>
@@ -316,6 +268,7 @@
           </w:tcPr>
           <w:p>
             <w:r>
+              <w:lastRenderedPageBreak/>
               <w:t>serverCM.jar</w:t>
             </w:r>
           </w:p>
@@ -495,15 +448,7 @@
         </w:numPr>
       </w:pPr>
       <w:r>
-        <w:t>Eseguire il comando: java -</w:t>
-      </w:r>
-      <w:proofErr w:type="spellStart"/>
-      <w:r>
-        <w:t>jar</w:t>
-      </w:r>
-      <w:proofErr w:type="spellEnd"/>
-      <w:r>
-        <w:t xml:space="preserve"> serverCM.jar.</w:t>
+        <w:t>Eseguire il comando: java -jar serverCM.jar.</w:t>
       </w:r>
     </w:p>
     <w:p>
@@ -538,15 +483,7 @@
         <w:t>ient</w:t>
       </w:r>
       <w:r>
-        <w:t>: java -</w:t>
-      </w:r>
-      <w:proofErr w:type="spellStart"/>
-      <w:r>
-        <w:t>jar</w:t>
-      </w:r>
-      <w:proofErr w:type="spellEnd"/>
-      <w:r>
-        <w:t xml:space="preserve"> clientCM.jar.</w:t>
+        <w:t>: java -jar clientCM.jar.</w:t>
       </w:r>
     </w:p>
     <w:p>
@@ -559,7 +496,7 @@
     </w:p>
     <w:p>
       <w:pPr>
-        <w:pStyle w:val="Titolo2"/>
+        <w:pStyle w:val="Heading2"/>
         <w:rPr>
           <w:i/>
           <w:iCs/>
@@ -592,23 +529,7 @@
           <w:b/>
           <w:bCs/>
         </w:rPr>
-        <w:t xml:space="preserve">Ricerca per Titolo (prossimi </w:t>
-      </w:r>
-      <w:proofErr w:type="gramStart"/>
-      <w:r>
-        <w:rPr>
-          <w:b/>
-          <w:bCs/>
-        </w:rPr>
-        <w:t>3</w:t>
-      </w:r>
-      <w:proofErr w:type="gramEnd"/>
-      <w:r>
-        <w:rPr>
-          <w:b/>
-          <w:bCs/>
-        </w:rPr>
-        <w:t xml:space="preserve"> mesi):</w:t>
+        <w:t>Ricerca per Titolo (prossimi 3 mesi):</w:t>
       </w:r>
       <w:r>
         <w:t xml:space="preserve"> Mostra esclusivamente le proiezioni programmate nell'immediato futuro.</w:t>
@@ -651,6 +572,7 @@
         <w:rPr>
           <w:noProof/>
         </w:rPr>
+        <w:lastRenderedPageBreak/>
         <w:drawing>
           <wp:inline distT="0" distB="0" distL="0" distR="0" wp14:anchorId="5E3C5AC6" wp14:editId="2060386A">
             <wp:extent cx="6120130" cy="4933950"/>
@@ -696,29 +618,19 @@
     </w:p>
     <w:p>
       <w:pPr>
-        <w:pStyle w:val="Didascalia"/>
+        <w:pStyle w:val="Caption"/>
       </w:pPr>
       <w:r>
         <w:t xml:space="preserve">Figura </w:t>
       </w:r>
-      <w:r>
-        <w:fldChar w:fldCharType="begin"/>
-      </w:r>
-      <w:r>
-        <w:instrText xml:space="preserve"> SEQ Figura \* ARABIC </w:instrText>
-      </w:r>
-      <w:r>
-        <w:fldChar w:fldCharType="separate"/>
-      </w:r>
-      <w:r>
-        <w:rPr>
-          <w:noProof/>
-        </w:rPr>
-        <w:t>1</w:t>
-      </w:r>
-      <w:r>
-        <w:fldChar w:fldCharType="end"/>
-      </w:r>
+      <w:fldSimple w:instr=" SEQ Figura \* ARABIC ">
+        <w:r>
+          <w:rPr>
+            <w:noProof/>
+          </w:rPr>
+          <w:t>1</w:t>
+        </w:r>
+      </w:fldSimple>
       <w:r>
         <w:t xml:space="preserve"> - Schermata iniziale</w:t>
       </w:r>
@@ -726,7 +638,7 @@
     <w:p/>
     <w:p>
       <w:pPr>
-        <w:pStyle w:val="Titolo2"/>
+        <w:pStyle w:val="Heading2"/>
       </w:pPr>
       <w:r>
         <w:t>4</w:t>
@@ -856,6 +768,7 @@
         <w:rPr>
           <w:noProof/>
         </w:rPr>
+        <w:lastRenderedPageBreak/>
         <w:drawing>
           <wp:inline distT="0" distB="0" distL="0" distR="0" wp14:anchorId="2F5211B4" wp14:editId="53287A5A">
             <wp:extent cx="6120130" cy="4932680"/>
@@ -901,7 +814,7 @@
     </w:p>
     <w:p>
       <w:pPr>
-        <w:pStyle w:val="Didascalia"/>
+        <w:pStyle w:val="Caption"/>
       </w:pPr>
       <w:r>
         <w:t>Figura 2 - Box Registrazione</w:t>
@@ -921,7 +834,7 @@
     <w:p/>
     <w:p>
       <w:pPr>
-        <w:pStyle w:val="Titolo2"/>
+        <w:pStyle w:val="Heading2"/>
       </w:pPr>
       <w:r>
         <w:t>5</w:t>
@@ -938,7 +851,7 @@
     <w:p/>
     <w:p>
       <w:pPr>
-        <w:pStyle w:val="Titolo3"/>
+        <w:pStyle w:val="Heading3"/>
       </w:pPr>
       <w:r>
         <w:t>5</w:t>
@@ -991,23 +904,7 @@
           <w:b/>
           <w:bCs/>
         </w:rPr>
-        <w:t xml:space="preserve">Ricerca per Titolo (prossimi </w:t>
-      </w:r>
-      <w:proofErr w:type="gramStart"/>
-      <w:r>
-        <w:rPr>
-          <w:b/>
-          <w:bCs/>
-        </w:rPr>
-        <w:t>3</w:t>
-      </w:r>
-      <w:proofErr w:type="gramEnd"/>
-      <w:r>
-        <w:rPr>
-          <w:b/>
-          <w:bCs/>
-        </w:rPr>
-        <w:t xml:space="preserve"> mesi):</w:t>
+        <w:t>Ricerca per Titolo (prossimi 3 mesi):</w:t>
       </w:r>
       <w:r>
         <w:t xml:space="preserve"> Mostra esclusivamente le proiezioni programmate nell'immediato futuro.</w:t>
@@ -1033,9 +930,10 @@
     </w:p>
     <w:p>
       <w:pPr>
-        <w:pStyle w:val="Titolo3"/>
-      </w:pPr>
-      <w:r>
+        <w:pStyle w:val="Heading3"/>
+      </w:pPr>
+      <w:r>
+        <w:lastRenderedPageBreak/>
         <w:t>5</w:t>
       </w:r>
       <w:r>
@@ -1055,13 +953,14 @@
         </w:numPr>
       </w:pPr>
       <w:r>
-        <w:t xml:space="preserve">Selezionare la proiezione </w:t>
-      </w:r>
-      <w:proofErr w:type="gramStart"/>
-      <w:r>
-        <w:t>d'interesse(</w:t>
-      </w:r>
-      <w:proofErr w:type="gramEnd"/>
+        <w:t>Selezionare la proiezione d</w:t>
+      </w:r>
+      <w:r>
+        <w:t>’</w:t>
+      </w:r>
+      <w:r>
+        <w:t>interesse(</w:t>
+      </w:r>
       <w:r>
         <w:t>vedi Figura 3</w:t>
       </w:r>
@@ -1106,14 +1005,11 @@
         <w:keepNext/>
       </w:pPr>
       <w:r>
-        <w:rPr>
-          <w:noProof/>
-        </w:rPr>
         <w:drawing>
-          <wp:inline distT="0" distB="0" distL="0" distR="0" wp14:anchorId="7444732F" wp14:editId="270A08DB">
-            <wp:extent cx="6120130" cy="4918075"/>
+          <wp:inline distT="0" distB="0" distL="0" distR="0" wp14:anchorId="0A9835B5" wp14:editId="5D149799">
+            <wp:extent cx="6120130" cy="4935855"/>
             <wp:effectExtent l="0" t="0" r="0" b="0"/>
-            <wp:docPr id="1413442169" name="Immagine 5"/>
+            <wp:docPr id="1273654178" name="Picture 1"/>
             <wp:cNvGraphicFramePr>
               <a:graphicFrameLocks xmlns:a="http://schemas.openxmlformats.org/drawingml/2006/main" noChangeAspect="1"/>
             </wp:cNvGraphicFramePr>
@@ -1121,17 +1017,11 @@
               <a:graphicData uri="http://schemas.openxmlformats.org/drawingml/2006/picture">
                 <pic:pic xmlns:pic="http://schemas.openxmlformats.org/drawingml/2006/picture">
                   <pic:nvPicPr>
-                    <pic:cNvPr id="1413442169" name="Immagine 1413442169"/>
+                    <pic:cNvPr id="1273654178" name=""/>
                     <pic:cNvPicPr/>
                   </pic:nvPicPr>
                   <pic:blipFill>
-                    <a:blip r:embed="rId9">
-                      <a:extLst>
-                        <a:ext uri="{28A0092B-C50C-407E-A947-70E740481C1C}">
-                          <a14:useLocalDpi xmlns:a14="http://schemas.microsoft.com/office/drawing/2010/main" val="0"/>
-                        </a:ext>
-                      </a:extLst>
-                    </a:blip>
+                    <a:blip r:embed="rId9"/>
                     <a:stretch>
                       <a:fillRect/>
                     </a:stretch>
@@ -1139,7 +1029,7 @@
                   <pic:spPr>
                     <a:xfrm>
                       <a:off x="0" y="0"/>
-                      <a:ext cx="6120130" cy="4918075"/>
+                      <a:ext cx="6120130" cy="4935855"/>
                     </a:xfrm>
                     <a:prstGeom prst="rect">
                       <a:avLst/>
@@ -1154,7 +1044,7 @@
     </w:p>
     <w:p>
       <w:pPr>
-        <w:pStyle w:val="Didascalia"/>
+        <w:pStyle w:val="Caption"/>
       </w:pPr>
       <w:r>
         <w:t>Figura 3 Prenota nuova proiezione</w:t>
@@ -1174,17 +1064,8 @@
           <w:b/>
           <w:bCs/>
         </w:rPr>
-        <w:t xml:space="preserve"> AVVISO: CODICE </w:t>
-      </w:r>
-      <w:proofErr w:type="gramStart"/>
-      <w:r>
-        <w:rPr>
-          <w:b/>
-          <w:bCs/>
-        </w:rPr>
-        <w:t>UNIVOCO</w:t>
-      </w:r>
-      <w:proofErr w:type="gramEnd"/>
+        <w:t xml:space="preserve"> AVVISO: CODICE UNIVOCO</w:t>
+      </w:r>
       <w:r>
         <w:t xml:space="preserve"> Al termine di ogni prenotazione, il sistema genera un codice univoco. È indispensabile annotare o conservare tale codice</w:t>
       </w:r>
@@ -1203,7 +1084,7 @@
     </w:p>
     <w:p>
       <w:pPr>
-        <w:pStyle w:val="Titolo3"/>
+        <w:pStyle w:val="Heading3"/>
       </w:pPr>
       <w:r>
         <w:t>5</w:t>
@@ -1242,6 +1123,46 @@
       </w:r>
       <w:r>
         <w:t xml:space="preserve"> Nella stessa sezione è possibile eliminare una proiezione</w:t>
+      </w:r>
+    </w:p>
+    <w:p>
+      <w:r>
+        <w:lastRenderedPageBreak/>
+        <w:drawing>
+          <wp:inline distT="0" distB="0" distL="0" distR="0" wp14:anchorId="27421BBA" wp14:editId="1FCD9A59">
+            <wp:extent cx="5110363" cy="4124664"/>
+            <wp:effectExtent l="0" t="0" r="0" b="0"/>
+            <wp:docPr id="247478061" name="Picture 1"/>
+            <wp:cNvGraphicFramePr>
+              <a:graphicFrameLocks xmlns:a="http://schemas.openxmlformats.org/drawingml/2006/main" noChangeAspect="1"/>
+            </wp:cNvGraphicFramePr>
+            <a:graphic xmlns:a="http://schemas.openxmlformats.org/drawingml/2006/main">
+              <a:graphicData uri="http://schemas.openxmlformats.org/drawingml/2006/picture">
+                <pic:pic xmlns:pic="http://schemas.openxmlformats.org/drawingml/2006/picture">
+                  <pic:nvPicPr>
+                    <pic:cNvPr id="247478061" name=""/>
+                    <pic:cNvPicPr/>
+                  </pic:nvPicPr>
+                  <pic:blipFill>
+                    <a:blip r:embed="rId10"/>
+                    <a:stretch>
+                      <a:fillRect/>
+                    </a:stretch>
+                  </pic:blipFill>
+                  <pic:spPr>
+                    <a:xfrm>
+                      <a:off x="0" y="0"/>
+                      <a:ext cx="5121912" cy="4133986"/>
+                    </a:xfrm>
+                    <a:prstGeom prst="rect">
+                      <a:avLst/>
+                    </a:prstGeom>
+                  </pic:spPr>
+                </pic:pic>
+              </a:graphicData>
+            </a:graphic>
+          </wp:inline>
+        </w:drawing>
       </w:r>
     </w:p>
     <w:p>
@@ -1537,7 +1458,7 @@
     </w:p>
     <w:p>
       <w:pPr>
-        <w:pStyle w:val="Titolo2"/>
+        <w:pStyle w:val="Heading2"/>
       </w:pPr>
       <w:r>
         <w:t>6</w:t>
@@ -1559,7 +1480,7 @@
     </w:p>
     <w:p>
       <w:pPr>
-        <w:pStyle w:val="Titolo3"/>
+        <w:pStyle w:val="Heading3"/>
       </w:pPr>
       <w:r>
         <w:t>6</w:t>
@@ -1615,23 +1536,7 @@
           <w:b/>
           <w:bCs/>
         </w:rPr>
-        <w:t xml:space="preserve">Ricerca per Titolo (prossimi </w:t>
-      </w:r>
-      <w:proofErr w:type="gramStart"/>
-      <w:r>
-        <w:rPr>
-          <w:b/>
-          <w:bCs/>
-        </w:rPr>
-        <w:t>3</w:t>
-      </w:r>
-      <w:proofErr w:type="gramEnd"/>
-      <w:r>
-        <w:rPr>
-          <w:b/>
-          <w:bCs/>
-        </w:rPr>
-        <w:t xml:space="preserve"> mesi):</w:t>
+        <w:t>Ricerca per Titolo (prossimi 3 mesi):</w:t>
       </w:r>
       <w:r>
         <w:t xml:space="preserve"> Mostra esclusivamente le proiezioni programmate nell'immediato futuro.</w:t>
@@ -1678,12 +1583,16 @@
         <w:t xml:space="preserve">e </w:t>
       </w:r>
       <w:r>
-        <w:t>la data, l’ora e il prezzo del biglietto per le proiezioni esistenti. Se per la proiezione scelta esistono delle prenotazioni attive, non è possibile modificare o eliminare la proiezione scelta.</w:t>
-      </w:r>
-    </w:p>
-    <w:p>
-      <w:pPr>
-        <w:pStyle w:val="Titolo3"/>
+        <w:t xml:space="preserve">la data, l’ora e il prezzo del biglietto per le proiezioni esistenti. Se per la </w:t>
+      </w:r>
+      <w:r>
+        <w:lastRenderedPageBreak/>
+        <w:t>proiezione scelta esistono delle prenotazioni attive, non è possibile modificare o eliminare la proiezione scelta.</w:t>
+      </w:r>
+    </w:p>
+    <w:p>
+      <w:pPr>
+        <w:pStyle w:val="Heading3"/>
       </w:pPr>
       <w:r>
         <w:t>6</w:t>
@@ -1806,7 +1715,7 @@
                     <pic:cNvPicPr/>
                   </pic:nvPicPr>
                   <pic:blipFill>
-                    <a:blip r:embed="rId10">
+                    <a:blip r:embed="rId11">
                       <a:extLst>
                         <a:ext uri="{28A0092B-C50C-407E-A947-70E740481C1C}">
                           <a14:useLocalDpi xmlns:a14="http://schemas.microsoft.com/office/drawing/2010/main" val="0"/>
@@ -1835,7 +1744,7 @@
     </w:p>
     <w:p>
       <w:pPr>
-        <w:pStyle w:val="Didascalia"/>
+        <w:pStyle w:val="Caption"/>
       </w:pPr>
       <w:r>
         <w:t>Figura 5: Inserimento nuova proiezione</w:t>
@@ -1843,9 +1752,10 @@
     </w:p>
     <w:p>
       <w:pPr>
-        <w:pStyle w:val="Titolo3"/>
-      </w:pPr>
-      <w:r>
+        <w:pStyle w:val="Heading3"/>
+      </w:pPr>
+      <w:r>
+        <w:lastRenderedPageBreak/>
         <w:t>6</w:t>
       </w:r>
       <w:r>
@@ -1876,7 +1786,7 @@
                     <pic:cNvPicPr/>
                   </pic:nvPicPr>
                   <pic:blipFill>
-                    <a:blip r:embed="rId11">
+                    <a:blip r:embed="rId12">
                       <a:extLst>
                         <a:ext uri="{28A0092B-C50C-407E-A947-70E740481C1C}">
                           <a14:useLocalDpi xmlns:a14="http://schemas.microsoft.com/office/drawing/2010/main" val="0"/>
@@ -1905,7 +1815,7 @@
     </w:p>
     <w:p>
       <w:pPr>
-        <w:pStyle w:val="Didascalia"/>
+        <w:pStyle w:val="Caption"/>
       </w:pPr>
       <w:r>
         <w:t>Figura 6: Storico proiezioni</w:t>
@@ -1913,7 +1823,7 @@
     </w:p>
     <w:p>
       <w:pPr>
-        <w:pStyle w:val="Titolo3"/>
+        <w:pStyle w:val="Heading3"/>
       </w:pPr>
       <w:r>
         <w:t>6</w:t>
@@ -2197,7 +2107,7 @@
     </w:p>
     <w:p>
       <w:pPr>
-        <w:pStyle w:val="Titolo2"/>
+        <w:pStyle w:val="Heading2"/>
       </w:pPr>
       <w:r>
         <w:t xml:space="preserve">7. </w:t>
@@ -2214,7 +2124,11 @@
         <w:t>Le funzioni principali del bigliettaio sono in consultazione: nella schermata “Ricerca prenotazioni” può ricercare le prenotazioni in base al codice della prenotazione, al nome e cognome del cliente, al titolo di film e a un range di date (tra data e data, entro una certa data, oltre una certa data).</w:t>
       </w:r>
       <w:r>
-        <w:t xml:space="preserve"> Selezionando una prenotazione è possibile visionare i dettagli della prenotazione e della proiezione a cui si riferisce.</w:t>
+        <w:t xml:space="preserve"> Selezionando una prenotazione è possibile visionare i dettagli della </w:t>
+      </w:r>
+      <w:r>
+        <w:lastRenderedPageBreak/>
+        <w:t>prenotazione e della proiezione a cui si riferisce.</w:t>
       </w:r>
       <w:r>
         <w:rPr>
@@ -2236,7 +2150,7 @@
                     <pic:cNvPicPr/>
                   </pic:nvPicPr>
                   <pic:blipFill>
-                    <a:blip r:embed="rId12">
+                    <a:blip r:embed="rId13">
                       <a:extLst>
                         <a:ext uri="{28A0092B-C50C-407E-A947-70E740481C1C}">
                           <a14:useLocalDpi xmlns:a14="http://schemas.microsoft.com/office/drawing/2010/main" val="0"/>
@@ -2265,28 +2179,15 @@
     </w:p>
     <w:p>
       <w:pPr>
-        <w:pStyle w:val="Didascalia"/>
+        <w:pStyle w:val="Caption"/>
       </w:pPr>
       <w:r>
         <w:t xml:space="preserve">Figura 7: ricerca prenotazioni </w:t>
       </w:r>
     </w:p>
     <w:p>
-      <w:proofErr w:type="gramStart"/>
-      <w:r>
-        <w:t>Inoltre</w:t>
-      </w:r>
-      <w:proofErr w:type="gramEnd"/>
-      <w:r>
-        <w:t xml:space="preserve"> il proiezionista </w:t>
-      </w:r>
-      <w:proofErr w:type="gramStart"/>
-      <w:r>
-        <w:t>può  inoltre</w:t>
-      </w:r>
-      <w:proofErr w:type="gramEnd"/>
-      <w:r>
-        <w:t xml:space="preserve"> visionare le prenotazioni odierne nella schermata “Prenotazioni di oggi”</w:t>
+      <w:r>
+        <w:t>Inoltre il proiezionista può  inoltre visionare le prenotazioni odierne nella schermata “Prenotazioni di oggi”</w:t>
       </w:r>
       <w:r>
         <w:t>. Anche in questo caso selezionando una prenotazione è possibile visionare i dettagli della stessa.</w:t>
@@ -2300,6 +2201,7 @@
         <w:rPr>
           <w:noProof/>
         </w:rPr>
+        <w:lastRenderedPageBreak/>
         <w:drawing>
           <wp:inline distT="0" distB="0" distL="0" distR="0" wp14:anchorId="7253B6BF" wp14:editId="5271A915">
             <wp:extent cx="6120130" cy="4937125"/>
@@ -2316,7 +2218,7 @@
                     <pic:cNvPicPr/>
                   </pic:nvPicPr>
                   <pic:blipFill>
-                    <a:blip r:embed="rId13">
+                    <a:blip r:embed="rId14">
                       <a:extLst>
                         <a:ext uri="{28A0092B-C50C-407E-A947-70E740481C1C}">
                           <a14:useLocalDpi xmlns:a14="http://schemas.microsoft.com/office/drawing/2010/main" val="0"/>
@@ -2345,7 +2247,7 @@
     </w:p>
     <w:p>
       <w:pPr>
-        <w:pStyle w:val="Didascalia"/>
+        <w:pStyle w:val="Caption"/>
       </w:pPr>
       <w:r>
         <w:t>Figura 8: prenotazioni odierne</w:t>
@@ -2361,7 +2263,7 @@
     </w:p>
     <w:p>
       <w:pPr>
-        <w:pStyle w:val="Titolo2"/>
+        <w:pStyle w:val="Heading2"/>
       </w:pPr>
       <w:r>
         <w:t>8</w:t>
@@ -2375,15 +2277,7 @@
     </w:p>
     <w:p>
       <w:r>
-        <w:t xml:space="preserve">La seguente matrice riassume le responsabilità e le autorizzazioni assegnate a ciascun profilo all'interno dell'ecosistema </w:t>
-      </w:r>
-      <w:proofErr w:type="spellStart"/>
-      <w:r>
-        <w:t>CineMax</w:t>
-      </w:r>
-      <w:proofErr w:type="spellEnd"/>
-      <w:r>
-        <w:t>.</w:t>
+        <w:t>La seguente matrice riassume le responsabilità e le autorizzazioni assegnate a ciascun profilo all'interno dell'ecosistema CineMax.</w:t>
       </w:r>
     </w:p>
     <w:p>
@@ -4453,15 +4347,15 @@
     <w:lsdException w:name="Unresolved Mention" w:semiHidden="1" w:unhideWhenUsed="1"/>
     <w:lsdException w:name="Smart Link" w:semiHidden="1" w:unhideWhenUsed="1"/>
   </w:latentStyles>
-  <w:style w:type="paragraph" w:default="1" w:styleId="Normale">
+  <w:style w:type="paragraph" w:default="1" w:styleId="Normal">
     <w:name w:val="Normal"/>
     <w:qFormat/>
   </w:style>
-  <w:style w:type="paragraph" w:styleId="Titolo1">
+  <w:style w:type="paragraph" w:styleId="Heading1">
     <w:name w:val="heading 1"/>
-    <w:basedOn w:val="Normale"/>
-    <w:next w:val="Normale"/>
-    <w:link w:val="Titolo1Carattere"/>
+    <w:basedOn w:val="Normal"/>
+    <w:next w:val="Normal"/>
+    <w:link w:val="Heading1Char"/>
     <w:uiPriority w:val="9"/>
     <w:qFormat/>
     <w:rsid w:val="00920552"/>
@@ -4478,11 +4372,11 @@
       <w:szCs w:val="40"/>
     </w:rPr>
   </w:style>
-  <w:style w:type="paragraph" w:styleId="Titolo2">
+  <w:style w:type="paragraph" w:styleId="Heading2">
     <w:name w:val="heading 2"/>
-    <w:basedOn w:val="Normale"/>
-    <w:next w:val="Normale"/>
-    <w:link w:val="Titolo2Carattere"/>
+    <w:basedOn w:val="Normal"/>
+    <w:next w:val="Normal"/>
+    <w:link w:val="Heading2Char"/>
     <w:uiPriority w:val="9"/>
     <w:unhideWhenUsed/>
     <w:qFormat/>
@@ -4500,11 +4394,11 @@
       <w:szCs w:val="32"/>
     </w:rPr>
   </w:style>
-  <w:style w:type="paragraph" w:styleId="Titolo3">
+  <w:style w:type="paragraph" w:styleId="Heading3">
     <w:name w:val="heading 3"/>
-    <w:basedOn w:val="Normale"/>
-    <w:next w:val="Normale"/>
-    <w:link w:val="Titolo3Carattere"/>
+    <w:basedOn w:val="Normal"/>
+    <w:next w:val="Normal"/>
+    <w:link w:val="Heading3Char"/>
     <w:uiPriority w:val="9"/>
     <w:unhideWhenUsed/>
     <w:qFormat/>
@@ -4522,11 +4416,11 @@
       <w:szCs w:val="28"/>
     </w:rPr>
   </w:style>
-  <w:style w:type="paragraph" w:styleId="Titolo4">
+  <w:style w:type="paragraph" w:styleId="Heading4">
     <w:name w:val="heading 4"/>
-    <w:basedOn w:val="Normale"/>
-    <w:next w:val="Normale"/>
-    <w:link w:val="Titolo4Carattere"/>
+    <w:basedOn w:val="Normal"/>
+    <w:next w:val="Normal"/>
+    <w:link w:val="Heading4Char"/>
     <w:uiPriority w:val="9"/>
     <w:semiHidden/>
     <w:unhideWhenUsed/>
@@ -4545,11 +4439,11 @@
       <w:color w:val="0F4761" w:themeColor="accent1" w:themeShade="BF"/>
     </w:rPr>
   </w:style>
-  <w:style w:type="paragraph" w:styleId="Titolo5">
+  <w:style w:type="paragraph" w:styleId="Heading5">
     <w:name w:val="heading 5"/>
-    <w:basedOn w:val="Normale"/>
-    <w:next w:val="Normale"/>
-    <w:link w:val="Titolo5Carattere"/>
+    <w:basedOn w:val="Normal"/>
+    <w:next w:val="Normal"/>
+    <w:link w:val="Heading5Char"/>
     <w:uiPriority w:val="9"/>
     <w:semiHidden/>
     <w:unhideWhenUsed/>
@@ -4566,11 +4460,11 @@
       <w:color w:val="0F4761" w:themeColor="accent1" w:themeShade="BF"/>
     </w:rPr>
   </w:style>
-  <w:style w:type="paragraph" w:styleId="Titolo6">
+  <w:style w:type="paragraph" w:styleId="Heading6">
     <w:name w:val="heading 6"/>
-    <w:basedOn w:val="Normale"/>
-    <w:next w:val="Normale"/>
-    <w:link w:val="Titolo6Carattere"/>
+    <w:basedOn w:val="Normal"/>
+    <w:next w:val="Normal"/>
+    <w:link w:val="Heading6Char"/>
     <w:uiPriority w:val="9"/>
     <w:semiHidden/>
     <w:unhideWhenUsed/>
@@ -4589,11 +4483,11 @@
       <w:color w:val="595959" w:themeColor="text1" w:themeTint="A6"/>
     </w:rPr>
   </w:style>
-  <w:style w:type="paragraph" w:styleId="Titolo7">
+  <w:style w:type="paragraph" w:styleId="Heading7">
     <w:name w:val="heading 7"/>
-    <w:basedOn w:val="Normale"/>
-    <w:next w:val="Normale"/>
-    <w:link w:val="Titolo7Carattere"/>
+    <w:basedOn w:val="Normal"/>
+    <w:next w:val="Normal"/>
+    <w:link w:val="Heading7Char"/>
     <w:uiPriority w:val="9"/>
     <w:semiHidden/>
     <w:unhideWhenUsed/>
@@ -4610,11 +4504,11 @@
       <w:color w:val="595959" w:themeColor="text1" w:themeTint="A6"/>
     </w:rPr>
   </w:style>
-  <w:style w:type="paragraph" w:styleId="Titolo8">
+  <w:style w:type="paragraph" w:styleId="Heading8">
     <w:name w:val="heading 8"/>
-    <w:basedOn w:val="Normale"/>
-    <w:next w:val="Normale"/>
-    <w:link w:val="Titolo8Carattere"/>
+    <w:basedOn w:val="Normal"/>
+    <w:next w:val="Normal"/>
+    <w:link w:val="Heading8Char"/>
     <w:uiPriority w:val="9"/>
     <w:semiHidden/>
     <w:unhideWhenUsed/>
@@ -4633,11 +4527,11 @@
       <w:color w:val="272727" w:themeColor="text1" w:themeTint="D8"/>
     </w:rPr>
   </w:style>
-  <w:style w:type="paragraph" w:styleId="Titolo9">
+  <w:style w:type="paragraph" w:styleId="Heading9">
     <w:name w:val="heading 9"/>
-    <w:basedOn w:val="Normale"/>
-    <w:next w:val="Normale"/>
-    <w:link w:val="Titolo9Carattere"/>
+    <w:basedOn w:val="Normal"/>
+    <w:next w:val="Normal"/>
+    <w:link w:val="Heading9Char"/>
     <w:uiPriority w:val="9"/>
     <w:semiHidden/>
     <w:unhideWhenUsed/>
@@ -4654,12 +4548,13 @@
       <w:color w:val="272727" w:themeColor="text1" w:themeTint="D8"/>
     </w:rPr>
   </w:style>
-  <w:style w:type="character" w:default="1" w:styleId="Carpredefinitoparagrafo">
+  <w:style w:type="character" w:default="1" w:styleId="DefaultParagraphFont">
     <w:name w:val="Default Paragraph Font"/>
     <w:uiPriority w:val="1"/>
+    <w:semiHidden/>
     <w:unhideWhenUsed/>
   </w:style>
-  <w:style w:type="table" w:default="1" w:styleId="Tabellanormale">
+  <w:style w:type="table" w:default="1" w:styleId="TableNormal">
     <w:name w:val="Normal Table"/>
     <w:uiPriority w:val="99"/>
     <w:semiHidden/>
@@ -4674,16 +4569,16 @@
       </w:tblCellMar>
     </w:tblPr>
   </w:style>
-  <w:style w:type="numbering" w:default="1" w:styleId="Nessunelenco">
+  <w:style w:type="numbering" w:default="1" w:styleId="NoList">
     <w:name w:val="No List"/>
     <w:uiPriority w:val="99"/>
     <w:semiHidden/>
     <w:unhideWhenUsed/>
   </w:style>
-  <w:style w:type="character" w:customStyle="1" w:styleId="Titolo1Carattere">
-    <w:name w:val="Titolo 1 Carattere"/>
-    <w:basedOn w:val="Carpredefinitoparagrafo"/>
-    <w:link w:val="Titolo1"/>
+  <w:style w:type="character" w:customStyle="1" w:styleId="Heading1Char">
+    <w:name w:val="Heading 1 Char"/>
+    <w:basedOn w:val="DefaultParagraphFont"/>
+    <w:link w:val="Heading1"/>
     <w:uiPriority w:val="9"/>
     <w:rsid w:val="00920552"/>
     <w:rPr>
@@ -4693,10 +4588,10 @@
       <w:szCs w:val="40"/>
     </w:rPr>
   </w:style>
-  <w:style w:type="character" w:customStyle="1" w:styleId="Titolo2Carattere">
-    <w:name w:val="Titolo 2 Carattere"/>
-    <w:basedOn w:val="Carpredefinitoparagrafo"/>
-    <w:link w:val="Titolo2"/>
+  <w:style w:type="character" w:customStyle="1" w:styleId="Heading2Char">
+    <w:name w:val="Heading 2 Char"/>
+    <w:basedOn w:val="DefaultParagraphFont"/>
+    <w:link w:val="Heading2"/>
     <w:uiPriority w:val="9"/>
     <w:rsid w:val="00920552"/>
     <w:rPr>
@@ -4706,10 +4601,10 @@
       <w:szCs w:val="32"/>
     </w:rPr>
   </w:style>
-  <w:style w:type="character" w:customStyle="1" w:styleId="Titolo3Carattere">
-    <w:name w:val="Titolo 3 Carattere"/>
-    <w:basedOn w:val="Carpredefinitoparagrafo"/>
-    <w:link w:val="Titolo3"/>
+  <w:style w:type="character" w:customStyle="1" w:styleId="Heading3Char">
+    <w:name w:val="Heading 3 Char"/>
+    <w:basedOn w:val="DefaultParagraphFont"/>
+    <w:link w:val="Heading3"/>
     <w:uiPriority w:val="9"/>
     <w:rsid w:val="00920552"/>
     <w:rPr>
@@ -4719,10 +4614,10 @@
       <w:szCs w:val="28"/>
     </w:rPr>
   </w:style>
-  <w:style w:type="character" w:customStyle="1" w:styleId="Titolo4Carattere">
-    <w:name w:val="Titolo 4 Carattere"/>
-    <w:basedOn w:val="Carpredefinitoparagrafo"/>
-    <w:link w:val="Titolo4"/>
+  <w:style w:type="character" w:customStyle="1" w:styleId="Heading4Char">
+    <w:name w:val="Heading 4 Char"/>
+    <w:basedOn w:val="DefaultParagraphFont"/>
+    <w:link w:val="Heading4"/>
     <w:uiPriority w:val="9"/>
     <w:semiHidden/>
     <w:rsid w:val="00920552"/>
@@ -4733,10 +4628,10 @@
       <w:color w:val="0F4761" w:themeColor="accent1" w:themeShade="BF"/>
     </w:rPr>
   </w:style>
-  <w:style w:type="character" w:customStyle="1" w:styleId="Titolo5Carattere">
-    <w:name w:val="Titolo 5 Carattere"/>
-    <w:basedOn w:val="Carpredefinitoparagrafo"/>
-    <w:link w:val="Titolo5"/>
+  <w:style w:type="character" w:customStyle="1" w:styleId="Heading5Char">
+    <w:name w:val="Heading 5 Char"/>
+    <w:basedOn w:val="DefaultParagraphFont"/>
+    <w:link w:val="Heading5"/>
     <w:uiPriority w:val="9"/>
     <w:semiHidden/>
     <w:rsid w:val="00920552"/>
@@ -4745,10 +4640,10 @@
       <w:color w:val="0F4761" w:themeColor="accent1" w:themeShade="BF"/>
     </w:rPr>
   </w:style>
-  <w:style w:type="character" w:customStyle="1" w:styleId="Titolo6Carattere">
-    <w:name w:val="Titolo 6 Carattere"/>
-    <w:basedOn w:val="Carpredefinitoparagrafo"/>
-    <w:link w:val="Titolo6"/>
+  <w:style w:type="character" w:customStyle="1" w:styleId="Heading6Char">
+    <w:name w:val="Heading 6 Char"/>
+    <w:basedOn w:val="DefaultParagraphFont"/>
+    <w:link w:val="Heading6"/>
     <w:uiPriority w:val="9"/>
     <w:semiHidden/>
     <w:rsid w:val="00920552"/>
@@ -4759,10 +4654,10 @@
       <w:color w:val="595959" w:themeColor="text1" w:themeTint="A6"/>
     </w:rPr>
   </w:style>
-  <w:style w:type="character" w:customStyle="1" w:styleId="Titolo7Carattere">
-    <w:name w:val="Titolo 7 Carattere"/>
-    <w:basedOn w:val="Carpredefinitoparagrafo"/>
-    <w:link w:val="Titolo7"/>
+  <w:style w:type="character" w:customStyle="1" w:styleId="Heading7Char">
+    <w:name w:val="Heading 7 Char"/>
+    <w:basedOn w:val="DefaultParagraphFont"/>
+    <w:link w:val="Heading7"/>
     <w:uiPriority w:val="9"/>
     <w:semiHidden/>
     <w:rsid w:val="00920552"/>
@@ -4771,10 +4666,10 @@
       <w:color w:val="595959" w:themeColor="text1" w:themeTint="A6"/>
     </w:rPr>
   </w:style>
-  <w:style w:type="character" w:customStyle="1" w:styleId="Titolo8Carattere">
-    <w:name w:val="Titolo 8 Carattere"/>
-    <w:basedOn w:val="Carpredefinitoparagrafo"/>
-    <w:link w:val="Titolo8"/>
+  <w:style w:type="character" w:customStyle="1" w:styleId="Heading8Char">
+    <w:name w:val="Heading 8 Char"/>
+    <w:basedOn w:val="DefaultParagraphFont"/>
+    <w:link w:val="Heading8"/>
     <w:uiPriority w:val="9"/>
     <w:semiHidden/>
     <w:rsid w:val="00920552"/>
@@ -4785,10 +4680,10 @@
       <w:color w:val="272727" w:themeColor="text1" w:themeTint="D8"/>
     </w:rPr>
   </w:style>
-  <w:style w:type="character" w:customStyle="1" w:styleId="Titolo9Carattere">
-    <w:name w:val="Titolo 9 Carattere"/>
-    <w:basedOn w:val="Carpredefinitoparagrafo"/>
-    <w:link w:val="Titolo9"/>
+  <w:style w:type="character" w:customStyle="1" w:styleId="Heading9Char">
+    <w:name w:val="Heading 9 Char"/>
+    <w:basedOn w:val="DefaultParagraphFont"/>
+    <w:link w:val="Heading9"/>
     <w:uiPriority w:val="9"/>
     <w:semiHidden/>
     <w:rsid w:val="00920552"/>
@@ -4797,11 +4692,11 @@
       <w:color w:val="272727" w:themeColor="text1" w:themeTint="D8"/>
     </w:rPr>
   </w:style>
-  <w:style w:type="paragraph" w:styleId="Titolo">
+  <w:style w:type="paragraph" w:styleId="Title">
     <w:name w:val="Title"/>
-    <w:basedOn w:val="Normale"/>
-    <w:next w:val="Normale"/>
-    <w:link w:val="TitoloCarattere"/>
+    <w:basedOn w:val="Normal"/>
+    <w:next w:val="Normal"/>
+    <w:link w:val="TitleChar"/>
     <w:uiPriority w:val="10"/>
     <w:qFormat/>
     <w:rsid w:val="00920552"/>
@@ -4817,10 +4712,10 @@
       <w:szCs w:val="56"/>
     </w:rPr>
   </w:style>
-  <w:style w:type="character" w:customStyle="1" w:styleId="TitoloCarattere">
-    <w:name w:val="Titolo Carattere"/>
-    <w:basedOn w:val="Carpredefinitoparagrafo"/>
-    <w:link w:val="Titolo"/>
+  <w:style w:type="character" w:customStyle="1" w:styleId="TitleChar">
+    <w:name w:val="Title Char"/>
+    <w:basedOn w:val="DefaultParagraphFont"/>
+    <w:link w:val="Title"/>
     <w:uiPriority w:val="10"/>
     <w:rsid w:val="00920552"/>
     <w:rPr>
@@ -4831,11 +4726,11 @@
       <w:szCs w:val="56"/>
     </w:rPr>
   </w:style>
-  <w:style w:type="paragraph" w:styleId="Sottotitolo">
+  <w:style w:type="paragraph" w:styleId="Subtitle">
     <w:name w:val="Subtitle"/>
-    <w:basedOn w:val="Normale"/>
-    <w:next w:val="Normale"/>
-    <w:link w:val="SottotitoloCarattere"/>
+    <w:basedOn w:val="Normal"/>
+    <w:next w:val="Normal"/>
+    <w:link w:val="SubtitleChar"/>
     <w:uiPriority w:val="11"/>
     <w:qFormat/>
     <w:rsid w:val="00920552"/>
@@ -4852,10 +4747,10 @@
       <w:szCs w:val="28"/>
     </w:rPr>
   </w:style>
-  <w:style w:type="character" w:customStyle="1" w:styleId="SottotitoloCarattere">
-    <w:name w:val="Sottotitolo Carattere"/>
-    <w:basedOn w:val="Carpredefinitoparagrafo"/>
-    <w:link w:val="Sottotitolo"/>
+  <w:style w:type="character" w:customStyle="1" w:styleId="SubtitleChar">
+    <w:name w:val="Subtitle Char"/>
+    <w:basedOn w:val="DefaultParagraphFont"/>
+    <w:link w:val="Subtitle"/>
     <w:uiPriority w:val="11"/>
     <w:rsid w:val="00920552"/>
     <w:rPr>
@@ -4866,11 +4761,11 @@
       <w:szCs w:val="28"/>
     </w:rPr>
   </w:style>
-  <w:style w:type="paragraph" w:styleId="Citazione">
+  <w:style w:type="paragraph" w:styleId="Quote">
     <w:name w:val="Quote"/>
-    <w:basedOn w:val="Normale"/>
-    <w:next w:val="Normale"/>
-    <w:link w:val="CitazioneCarattere"/>
+    <w:basedOn w:val="Normal"/>
+    <w:next w:val="Normal"/>
+    <w:link w:val="QuoteChar"/>
     <w:uiPriority w:val="29"/>
     <w:qFormat/>
     <w:rsid w:val="00920552"/>
@@ -4884,10 +4779,10 @@
       <w:color w:val="404040" w:themeColor="text1" w:themeTint="BF"/>
     </w:rPr>
   </w:style>
-  <w:style w:type="character" w:customStyle="1" w:styleId="CitazioneCarattere">
-    <w:name w:val="Citazione Carattere"/>
-    <w:basedOn w:val="Carpredefinitoparagrafo"/>
-    <w:link w:val="Citazione"/>
+  <w:style w:type="character" w:customStyle="1" w:styleId="QuoteChar">
+    <w:name w:val="Quote Char"/>
+    <w:basedOn w:val="DefaultParagraphFont"/>
+    <w:link w:val="Quote"/>
     <w:uiPriority w:val="29"/>
     <w:rsid w:val="00920552"/>
     <w:rPr>
@@ -4896,9 +4791,9 @@
       <w:color w:val="404040" w:themeColor="text1" w:themeTint="BF"/>
     </w:rPr>
   </w:style>
-  <w:style w:type="paragraph" w:styleId="Paragrafoelenco">
+  <w:style w:type="paragraph" w:styleId="ListParagraph">
     <w:name w:val="List Paragraph"/>
-    <w:basedOn w:val="Normale"/>
+    <w:basedOn w:val="Normal"/>
     <w:uiPriority w:val="34"/>
     <w:qFormat/>
     <w:rsid w:val="00920552"/>
@@ -4907,9 +4802,9 @@
       <w:contextualSpacing/>
     </w:pPr>
   </w:style>
-  <w:style w:type="character" w:styleId="Enfasiintensa">
+  <w:style w:type="character" w:styleId="IntenseEmphasis">
     <w:name w:val="Intense Emphasis"/>
-    <w:basedOn w:val="Carpredefinitoparagrafo"/>
+    <w:basedOn w:val="DefaultParagraphFont"/>
     <w:uiPriority w:val="21"/>
     <w:qFormat/>
     <w:rsid w:val="00920552"/>
@@ -4919,11 +4814,11 @@
       <w:color w:val="0F4761" w:themeColor="accent1" w:themeShade="BF"/>
     </w:rPr>
   </w:style>
-  <w:style w:type="paragraph" w:styleId="Citazioneintensa">
+  <w:style w:type="paragraph" w:styleId="IntenseQuote">
     <w:name w:val="Intense Quote"/>
-    <w:basedOn w:val="Normale"/>
-    <w:next w:val="Normale"/>
-    <w:link w:val="CitazioneintensaCarattere"/>
+    <w:basedOn w:val="Normal"/>
+    <w:next w:val="Normal"/>
+    <w:link w:val="IntenseQuoteChar"/>
     <w:uiPriority w:val="30"/>
     <w:qFormat/>
     <w:rsid w:val="00920552"/>
@@ -4942,10 +4837,10 @@
       <w:color w:val="0F4761" w:themeColor="accent1" w:themeShade="BF"/>
     </w:rPr>
   </w:style>
-  <w:style w:type="character" w:customStyle="1" w:styleId="CitazioneintensaCarattere">
-    <w:name w:val="Citazione intensa Carattere"/>
-    <w:basedOn w:val="Carpredefinitoparagrafo"/>
-    <w:link w:val="Citazioneintensa"/>
+  <w:style w:type="character" w:customStyle="1" w:styleId="IntenseQuoteChar">
+    <w:name w:val="Intense Quote Char"/>
+    <w:basedOn w:val="DefaultParagraphFont"/>
+    <w:link w:val="IntenseQuote"/>
     <w:uiPriority w:val="30"/>
     <w:rsid w:val="00920552"/>
     <w:rPr>
@@ -4954,9 +4849,9 @@
       <w:color w:val="0F4761" w:themeColor="accent1" w:themeShade="BF"/>
     </w:rPr>
   </w:style>
-  <w:style w:type="character" w:styleId="Riferimentointenso">
+  <w:style w:type="character" w:styleId="IntenseReference">
     <w:name w:val="Intense Reference"/>
-    <w:basedOn w:val="Carpredefinitoparagrafo"/>
+    <w:basedOn w:val="DefaultParagraphFont"/>
     <w:uiPriority w:val="32"/>
     <w:qFormat/>
     <w:rsid w:val="00920552"/>
@@ -4968,10 +4863,10 @@
       <w:spacing w:val="5"/>
     </w:rPr>
   </w:style>
-  <w:style w:type="paragraph" w:styleId="Didascalia">
+  <w:style w:type="paragraph" w:styleId="Caption">
     <w:name w:val="caption"/>
-    <w:basedOn w:val="Normale"/>
-    <w:next w:val="Normale"/>
+    <w:basedOn w:val="Normal"/>
+    <w:next w:val="Normal"/>
     <w:uiPriority w:val="35"/>
     <w:unhideWhenUsed/>
     <w:qFormat/>
@@ -4987,10 +4882,10 @@
       <w:szCs w:val="18"/>
     </w:rPr>
   </w:style>
-  <w:style w:type="paragraph" w:styleId="Intestazione">
+  <w:style w:type="paragraph" w:styleId="Header">
     <w:name w:val="header"/>
-    <w:basedOn w:val="Normale"/>
-    <w:link w:val="IntestazioneCarattere"/>
+    <w:basedOn w:val="Normal"/>
+    <w:link w:val="HeaderChar"/>
     <w:uiPriority w:val="99"/>
     <w:unhideWhenUsed/>
     <w:rsid w:val="00312118"/>
@@ -5002,17 +4897,17 @@
       <w:spacing w:after="0" w:line="240" w:lineRule="auto"/>
     </w:pPr>
   </w:style>
-  <w:style w:type="character" w:customStyle="1" w:styleId="IntestazioneCarattere">
-    <w:name w:val="Intestazione Carattere"/>
-    <w:basedOn w:val="Carpredefinitoparagrafo"/>
-    <w:link w:val="Intestazione"/>
+  <w:style w:type="character" w:customStyle="1" w:styleId="HeaderChar">
+    <w:name w:val="Header Char"/>
+    <w:basedOn w:val="DefaultParagraphFont"/>
+    <w:link w:val="Header"/>
     <w:uiPriority w:val="99"/>
     <w:rsid w:val="00312118"/>
   </w:style>
-  <w:style w:type="paragraph" w:styleId="Pidipagina">
+  <w:style w:type="paragraph" w:styleId="Footer">
     <w:name w:val="footer"/>
-    <w:basedOn w:val="Normale"/>
-    <w:link w:val="PidipaginaCarattere"/>
+    <w:basedOn w:val="Normal"/>
+    <w:link w:val="FooterChar"/>
     <w:uiPriority w:val="99"/>
     <w:unhideWhenUsed/>
     <w:rsid w:val="00312118"/>
@@ -5024,10 +4919,10 @@
       <w:spacing w:after="0" w:line="240" w:lineRule="auto"/>
     </w:pPr>
   </w:style>
-  <w:style w:type="character" w:customStyle="1" w:styleId="PidipaginaCarattere">
-    <w:name w:val="Piè di pagina Carattere"/>
-    <w:basedOn w:val="Carpredefinitoparagrafo"/>
-    <w:link w:val="Pidipagina"/>
+  <w:style w:type="character" w:customStyle="1" w:styleId="FooterChar">
+    <w:name w:val="Footer Char"/>
+    <w:basedOn w:val="DefaultParagraphFont"/>
+    <w:link w:val="Footer"/>
     <w:uiPriority w:val="99"/>
     <w:rsid w:val="00312118"/>
   </w:style>

</xml_diff>